<commit_message>
updated guidelines for CAD files - to be further updated
</commit_message>
<xml_diff>
--- a/Corporate/Guideline_260724_File_Organisation.docx
+++ b/Corporate/Guideline_260724_File_Organisation.docx
@@ -83,7 +83,6 @@
           <w:bCs/>
         </w:rPr>
       </w:pPr>
-      <w:proofErr w:type="spellStart"/>
       <w:r>
         <w:rPr>
           <w:rFonts w:ascii="Calibri Light" w:hAnsi="Calibri Light" w:cs="Calibri Light"/>
@@ -92,7 +91,6 @@
         </w:rPr>
         <w:t>OrgoFly</w:t>
       </w:r>
-      <w:proofErr w:type="spellEnd"/>
     </w:p>
     <w:p>
       <w:pPr>
@@ -295,7 +293,20 @@
               <w:rPr>
                 <w:rFonts w:ascii="Calibri" w:hAnsi="Calibri" w:cs="Calibri"/>
               </w:rPr>
-              <w:t>24/Jul/2026</w:t>
+              <w:t>2</w:t>
+            </w:r>
+            <w:r>
+              <w:rPr>
+                <w:rFonts w:ascii="Calibri" w:hAnsi="Calibri" w:cs="Calibri"/>
+                <w:lang w:val="bg-BG"/>
+              </w:rPr>
+              <w:t>8</w:t>
+            </w:r>
+            <w:r>
+              <w:rPr>
+                <w:rFonts w:ascii="Calibri" w:hAnsi="Calibri" w:cs="Calibri"/>
+              </w:rPr>
+              <w:t>/Jul/2026</w:t>
             </w:r>
           </w:p>
         </w:tc>
@@ -411,21 +422,7 @@
         <w:rPr>
           <w:rFonts w:ascii="Calibri" w:hAnsi="Calibri" w:cs="Calibri"/>
         </w:rPr>
-        <w:t xml:space="preserve">This document defines how SolidWorks files for </w:t>
-      </w:r>
-      <w:proofErr w:type="spellStart"/>
-      <w:r>
-        <w:rPr>
-          <w:rFonts w:ascii="Calibri" w:hAnsi="Calibri" w:cs="Calibri"/>
-        </w:rPr>
-        <w:t>OrgoFly</w:t>
-      </w:r>
-      <w:proofErr w:type="spellEnd"/>
-      <w:r>
-        <w:rPr>
-          <w:rFonts w:ascii="Calibri" w:hAnsi="Calibri" w:cs="Calibri"/>
-        </w:rPr>
-        <w:t xml:space="preserve"> shall be named, stored, updated, and archived.</w:t>
+        <w:t>This document defines how SolidWorks files for OrgoFly shall be named, stored, updated, and archived.</w:t>
       </w:r>
     </w:p>
     <w:p>
@@ -603,1017 +600,9 @@
         <w:spacing w:after="0"/>
         <w:rPr>
           <w:rFonts w:ascii="Calibri" w:hAnsi="Calibri" w:cs="Calibri"/>
-        </w:rPr>
-      </w:pPr>
-      <w:r>
-        <w:rPr>
-          <w:rFonts w:ascii="Calibri" w:hAnsi="Calibri" w:cs="Calibri"/>
-        </w:rPr>
-        <w:t>ORGOFLY_PROTOTYPE_01</w:t>
-      </w:r>
-      <w:r>
-        <w:rPr>
-          <w:rFonts w:ascii="Calibri" w:hAnsi="Calibri" w:cs="Calibri"/>
-        </w:rPr>
-        <w:t>_CAD</w:t>
-      </w:r>
-      <w:r>
-        <w:rPr>
-          <w:rFonts w:ascii="Calibri" w:hAnsi="Calibri" w:cs="Calibri"/>
-        </w:rPr>
-        <w:t>/</w:t>
-      </w:r>
-    </w:p>
-    <w:p>
-      <w:pPr>
-        <w:spacing w:after="0"/>
-        <w:rPr>
-          <w:rFonts w:ascii="Calibri" w:hAnsi="Calibri" w:cs="Calibri"/>
-        </w:rPr>
-      </w:pPr>
-      <w:r>
-        <w:rPr>
-          <w:rFonts w:ascii="Calibri" w:hAnsi="Calibri" w:cs="Calibri"/>
-        </w:rPr>
-        <w:t>│</w:t>
-      </w:r>
-    </w:p>
-    <w:p>
-      <w:pPr>
-        <w:spacing w:after="0"/>
-        <w:rPr>
-          <w:rFonts w:ascii="Calibri" w:hAnsi="Calibri" w:cs="Calibri"/>
-        </w:rPr>
-      </w:pPr>
-      <w:r>
-        <w:rPr>
-          <w:rFonts w:ascii="MS Gothic" w:eastAsia="MS Gothic" w:hAnsi="MS Gothic" w:cs="MS Gothic" w:hint="eastAsia"/>
-        </w:rPr>
-        <w:t>├</w:t>
-      </w:r>
-      <w:r>
-        <w:rPr>
-          <w:rFonts w:ascii="Calibri" w:hAnsi="Calibri" w:cs="Calibri"/>
-        </w:rPr>
-        <w:t>── 00_TOP_LEVEL/</w:t>
-      </w:r>
-    </w:p>
-    <w:p>
-      <w:pPr>
-        <w:spacing w:after="0"/>
-        <w:rPr>
-          <w:rFonts w:ascii="Calibri" w:hAnsi="Calibri" w:cs="Calibri"/>
-        </w:rPr>
-      </w:pPr>
-      <w:r>
-        <w:rPr>
-          <w:rFonts w:ascii="Calibri" w:hAnsi="Calibri" w:cs="Calibri"/>
-        </w:rPr>
-        <w:t>│</w:t>
-      </w:r>
-    </w:p>
-    <w:p>
-      <w:pPr>
-        <w:spacing w:after="0"/>
-        <w:rPr>
-          <w:rFonts w:ascii="Calibri" w:hAnsi="Calibri" w:cs="Calibri"/>
-        </w:rPr>
-      </w:pPr>
-      <w:r>
-        <w:rPr>
-          <w:rFonts w:ascii="MS Gothic" w:eastAsia="MS Gothic" w:hAnsi="MS Gothic" w:cs="MS Gothic" w:hint="eastAsia"/>
-        </w:rPr>
-        <w:t>├</w:t>
-      </w:r>
-      <w:r>
-        <w:rPr>
-          <w:rFonts w:ascii="Calibri" w:hAnsi="Calibri" w:cs="Calibri"/>
-        </w:rPr>
-        <w:t>── 10_MASTER_GEOMETRY/</w:t>
-      </w:r>
-    </w:p>
-    <w:p>
-      <w:pPr>
-        <w:spacing w:after="0"/>
-        <w:rPr>
-          <w:rFonts w:ascii="Calibri" w:hAnsi="Calibri" w:cs="Calibri"/>
-        </w:rPr>
-      </w:pPr>
-      <w:r>
-        <w:rPr>
-          <w:rFonts w:ascii="Calibri" w:hAnsi="Calibri" w:cs="Calibri"/>
-        </w:rPr>
-        <w:t>│</w:t>
-      </w:r>
-    </w:p>
-    <w:p>
-      <w:pPr>
-        <w:spacing w:after="0"/>
-        <w:rPr>
-          <w:rFonts w:ascii="Calibri" w:hAnsi="Calibri" w:cs="Calibri"/>
-        </w:rPr>
-      </w:pPr>
-      <w:r>
-        <w:rPr>
-          <w:rFonts w:ascii="MS Gothic" w:eastAsia="MS Gothic" w:hAnsi="MS Gothic" w:cs="MS Gothic" w:hint="eastAsia"/>
-        </w:rPr>
-        <w:t>├</w:t>
-      </w:r>
-      <w:r>
-        <w:rPr>
-          <w:rFonts w:ascii="Calibri" w:hAnsi="Calibri" w:cs="Calibri"/>
-        </w:rPr>
-        <w:t>── 20_FUSELAGE/</w:t>
-      </w:r>
-    </w:p>
-    <w:p>
-      <w:pPr>
-        <w:spacing w:after="0"/>
-        <w:rPr>
-          <w:rFonts w:ascii="Calibri" w:hAnsi="Calibri" w:cs="Calibri"/>
-        </w:rPr>
-      </w:pPr>
-      <w:r>
-        <w:rPr>
-          <w:rFonts w:ascii="Calibri" w:hAnsi="Calibri" w:cs="Calibri"/>
-        </w:rPr>
-        <w:t xml:space="preserve">│   </w:t>
-      </w:r>
-      <w:r>
-        <w:rPr>
-          <w:rFonts w:ascii="MS Gothic" w:eastAsia="MS Gothic" w:hAnsi="MS Gothic" w:cs="MS Gothic" w:hint="eastAsia"/>
-        </w:rPr>
-        <w:t>├</w:t>
-      </w:r>
-      <w:r>
-        <w:rPr>
-          <w:rFonts w:ascii="Calibri" w:hAnsi="Calibri" w:cs="Calibri"/>
-        </w:rPr>
-        <w:t>── Parts/</w:t>
-      </w:r>
-    </w:p>
-    <w:p>
-      <w:pPr>
-        <w:spacing w:after="0"/>
-        <w:rPr>
-          <w:rFonts w:ascii="Calibri" w:hAnsi="Calibri" w:cs="Calibri"/>
-        </w:rPr>
-      </w:pPr>
-      <w:r>
-        <w:rPr>
-          <w:rFonts w:ascii="Calibri" w:hAnsi="Calibri" w:cs="Calibri"/>
-        </w:rPr>
-        <w:t>│   └── Assemblies/</w:t>
-      </w:r>
-    </w:p>
-    <w:p>
-      <w:pPr>
-        <w:spacing w:after="0"/>
-        <w:rPr>
-          <w:rFonts w:ascii="Calibri" w:hAnsi="Calibri" w:cs="Calibri"/>
-        </w:rPr>
-      </w:pPr>
-      <w:r>
-        <w:rPr>
-          <w:rFonts w:ascii="Calibri" w:hAnsi="Calibri" w:cs="Calibri"/>
-        </w:rPr>
-        <w:t>│</w:t>
-      </w:r>
-    </w:p>
-    <w:p>
-      <w:pPr>
-        <w:spacing w:after="0"/>
-        <w:rPr>
-          <w:rFonts w:ascii="Calibri" w:hAnsi="Calibri" w:cs="Calibri"/>
-        </w:rPr>
-      </w:pPr>
-      <w:r>
-        <w:rPr>
-          <w:rFonts w:ascii="MS Gothic" w:eastAsia="MS Gothic" w:hAnsi="MS Gothic" w:cs="MS Gothic" w:hint="eastAsia"/>
-        </w:rPr>
-        <w:t>├</w:t>
-      </w:r>
-      <w:r>
-        <w:rPr>
-          <w:rFonts w:ascii="Calibri" w:hAnsi="Calibri" w:cs="Calibri"/>
-        </w:rPr>
-        <w:t>── 30_WING/</w:t>
-      </w:r>
-    </w:p>
-    <w:p>
-      <w:pPr>
-        <w:spacing w:after="0"/>
-        <w:rPr>
-          <w:rFonts w:ascii="Calibri" w:hAnsi="Calibri" w:cs="Calibri"/>
-        </w:rPr>
-      </w:pPr>
-      <w:r>
-        <w:rPr>
-          <w:rFonts w:ascii="Calibri" w:hAnsi="Calibri" w:cs="Calibri"/>
-        </w:rPr>
-        <w:t xml:space="preserve">│   </w:t>
-      </w:r>
-      <w:r>
-        <w:rPr>
-          <w:rFonts w:ascii="MS Gothic" w:eastAsia="MS Gothic" w:hAnsi="MS Gothic" w:cs="MS Gothic" w:hint="eastAsia"/>
-        </w:rPr>
-        <w:t>├</w:t>
-      </w:r>
-      <w:r>
-        <w:rPr>
-          <w:rFonts w:ascii="Calibri" w:hAnsi="Calibri" w:cs="Calibri"/>
-        </w:rPr>
-        <w:t>── Parts/</w:t>
-      </w:r>
-    </w:p>
-    <w:p>
-      <w:pPr>
-        <w:spacing w:after="0"/>
-        <w:rPr>
-          <w:rFonts w:ascii="Calibri" w:hAnsi="Calibri" w:cs="Calibri"/>
-        </w:rPr>
-      </w:pPr>
-      <w:r>
-        <w:rPr>
-          <w:rFonts w:ascii="Calibri" w:hAnsi="Calibri" w:cs="Calibri"/>
-        </w:rPr>
-        <w:t>│   └── Assemblies/</w:t>
-      </w:r>
-    </w:p>
-    <w:p>
-      <w:pPr>
-        <w:spacing w:after="0"/>
-        <w:rPr>
-          <w:rFonts w:ascii="Calibri" w:hAnsi="Calibri" w:cs="Calibri"/>
-        </w:rPr>
-      </w:pPr>
-      <w:r>
-        <w:rPr>
-          <w:rFonts w:ascii="Calibri" w:hAnsi="Calibri" w:cs="Calibri"/>
-        </w:rPr>
-        <w:t>│</w:t>
-      </w:r>
-    </w:p>
-    <w:p>
-      <w:pPr>
-        <w:spacing w:after="0"/>
-        <w:rPr>
-          <w:rFonts w:ascii="Calibri" w:hAnsi="Calibri" w:cs="Calibri"/>
-        </w:rPr>
-      </w:pPr>
-      <w:r>
-        <w:rPr>
-          <w:rFonts w:ascii="MS Gothic" w:eastAsia="MS Gothic" w:hAnsi="MS Gothic" w:cs="MS Gothic" w:hint="eastAsia"/>
-        </w:rPr>
-        <w:t>├</w:t>
-      </w:r>
-      <w:r>
-        <w:rPr>
-          <w:rFonts w:ascii="Calibri" w:hAnsi="Calibri" w:cs="Calibri"/>
-        </w:rPr>
-        <w:t>── 40_TAIL/</w:t>
-      </w:r>
-    </w:p>
-    <w:p>
-      <w:pPr>
-        <w:spacing w:after="0"/>
-        <w:rPr>
-          <w:rFonts w:ascii="Calibri" w:hAnsi="Calibri" w:cs="Calibri"/>
-        </w:rPr>
-      </w:pPr>
-      <w:r>
-        <w:rPr>
-          <w:rFonts w:ascii="Calibri" w:hAnsi="Calibri" w:cs="Calibri"/>
-        </w:rPr>
-        <w:t xml:space="preserve">│   </w:t>
-      </w:r>
-      <w:r>
-        <w:rPr>
-          <w:rFonts w:ascii="MS Gothic" w:eastAsia="MS Gothic" w:hAnsi="MS Gothic" w:cs="MS Gothic" w:hint="eastAsia"/>
-        </w:rPr>
-        <w:t>├</w:t>
-      </w:r>
-      <w:r>
-        <w:rPr>
-          <w:rFonts w:ascii="Calibri" w:hAnsi="Calibri" w:cs="Calibri"/>
-        </w:rPr>
-        <w:t>── Parts/</w:t>
-      </w:r>
-    </w:p>
-    <w:p>
-      <w:pPr>
-        <w:spacing w:after="0"/>
-        <w:rPr>
-          <w:rFonts w:ascii="Calibri" w:hAnsi="Calibri" w:cs="Calibri"/>
-        </w:rPr>
-      </w:pPr>
-      <w:r>
-        <w:rPr>
-          <w:rFonts w:ascii="Calibri" w:hAnsi="Calibri" w:cs="Calibri"/>
-        </w:rPr>
-        <w:t>│   └── Assemblies/</w:t>
-      </w:r>
-    </w:p>
-    <w:p>
-      <w:pPr>
-        <w:spacing w:after="0"/>
-        <w:rPr>
-          <w:rFonts w:ascii="Calibri" w:hAnsi="Calibri" w:cs="Calibri"/>
-        </w:rPr>
-      </w:pPr>
-      <w:r>
-        <w:rPr>
-          <w:rFonts w:ascii="Calibri" w:hAnsi="Calibri" w:cs="Calibri"/>
-        </w:rPr>
-        <w:t>│</w:t>
-      </w:r>
-    </w:p>
-    <w:p>
-      <w:pPr>
-        <w:spacing w:after="0"/>
-        <w:rPr>
-          <w:rFonts w:ascii="Calibri" w:hAnsi="Calibri" w:cs="Calibri"/>
-        </w:rPr>
-      </w:pPr>
-      <w:r>
-        <w:rPr>
-          <w:rFonts w:ascii="MS Gothic" w:eastAsia="MS Gothic" w:hAnsi="MS Gothic" w:cs="MS Gothic" w:hint="eastAsia"/>
-        </w:rPr>
-        <w:t>├</w:t>
-      </w:r>
-      <w:r>
-        <w:rPr>
-          <w:rFonts w:ascii="Calibri" w:hAnsi="Calibri" w:cs="Calibri"/>
-        </w:rPr>
-        <w:t>── 50_PROPULSION_AND_TILT/</w:t>
-      </w:r>
-    </w:p>
-    <w:p>
-      <w:pPr>
-        <w:spacing w:after="0"/>
-        <w:rPr>
-          <w:rFonts w:ascii="Calibri" w:hAnsi="Calibri" w:cs="Calibri"/>
-        </w:rPr>
-      </w:pPr>
-      <w:r>
-        <w:rPr>
-          <w:rFonts w:ascii="Calibri" w:hAnsi="Calibri" w:cs="Calibri"/>
-        </w:rPr>
-        <w:t xml:space="preserve">│   </w:t>
-      </w:r>
-      <w:r>
-        <w:rPr>
-          <w:rFonts w:ascii="MS Gothic" w:eastAsia="MS Gothic" w:hAnsi="MS Gothic" w:cs="MS Gothic" w:hint="eastAsia"/>
-        </w:rPr>
-        <w:t>├</w:t>
-      </w:r>
-      <w:r>
-        <w:rPr>
-          <w:rFonts w:ascii="Calibri" w:hAnsi="Calibri" w:cs="Calibri"/>
-        </w:rPr>
-        <w:t>── Parts/</w:t>
-      </w:r>
-    </w:p>
-    <w:p>
-      <w:pPr>
-        <w:spacing w:after="0"/>
-        <w:rPr>
-          <w:rFonts w:ascii="Calibri" w:hAnsi="Calibri" w:cs="Calibri"/>
-        </w:rPr>
-      </w:pPr>
-      <w:r>
-        <w:rPr>
-          <w:rFonts w:ascii="Calibri" w:hAnsi="Calibri" w:cs="Calibri"/>
-        </w:rPr>
-        <w:t xml:space="preserve">│   </w:t>
-      </w:r>
-      <w:r>
-        <w:rPr>
-          <w:rFonts w:ascii="MS Gothic" w:eastAsia="MS Gothic" w:hAnsi="MS Gothic" w:cs="MS Gothic" w:hint="eastAsia"/>
-        </w:rPr>
-        <w:t>├</w:t>
-      </w:r>
-      <w:r>
-        <w:rPr>
-          <w:rFonts w:ascii="Calibri" w:hAnsi="Calibri" w:cs="Calibri"/>
-        </w:rPr>
-        <w:t>── Assemblies/</w:t>
-      </w:r>
-    </w:p>
-    <w:p>
-      <w:pPr>
-        <w:spacing w:after="0"/>
-        <w:rPr>
-          <w:rFonts w:ascii="Calibri" w:hAnsi="Calibri" w:cs="Calibri"/>
-        </w:rPr>
-      </w:pPr>
-      <w:r>
-        <w:rPr>
-          <w:rFonts w:ascii="Calibri" w:hAnsi="Calibri" w:cs="Calibri"/>
-        </w:rPr>
-        <w:t>│   └── Purchased/</w:t>
-      </w:r>
-    </w:p>
-    <w:p>
-      <w:pPr>
-        <w:spacing w:after="0"/>
-        <w:rPr>
-          <w:rFonts w:ascii="Calibri" w:hAnsi="Calibri" w:cs="Calibri"/>
-        </w:rPr>
-      </w:pPr>
-      <w:r>
-        <w:rPr>
-          <w:rFonts w:ascii="Calibri" w:hAnsi="Calibri" w:cs="Calibri"/>
-        </w:rPr>
-        <w:t>│</w:t>
-      </w:r>
-    </w:p>
-    <w:p>
-      <w:pPr>
-        <w:spacing w:after="0"/>
-        <w:rPr>
-          <w:rFonts w:ascii="Calibri" w:hAnsi="Calibri" w:cs="Calibri"/>
-        </w:rPr>
-      </w:pPr>
-      <w:r>
-        <w:rPr>
-          <w:rFonts w:ascii="MS Gothic" w:eastAsia="MS Gothic" w:hAnsi="MS Gothic" w:cs="MS Gothic" w:hint="eastAsia"/>
-        </w:rPr>
-        <w:t>├</w:t>
-      </w:r>
-      <w:r>
-        <w:rPr>
-          <w:rFonts w:ascii="Calibri" w:hAnsi="Calibri" w:cs="Calibri"/>
-        </w:rPr>
-        <w:t>── 60_LANDING_GEAR/</w:t>
-      </w:r>
-    </w:p>
-    <w:p>
-      <w:pPr>
-        <w:spacing w:after="0"/>
-        <w:rPr>
-          <w:rFonts w:ascii="Calibri" w:hAnsi="Calibri" w:cs="Calibri"/>
-        </w:rPr>
-      </w:pPr>
-      <w:r>
-        <w:rPr>
-          <w:rFonts w:ascii="Calibri" w:hAnsi="Calibri" w:cs="Calibri"/>
-        </w:rPr>
-        <w:t xml:space="preserve">│   </w:t>
-      </w:r>
-      <w:r>
-        <w:rPr>
-          <w:rFonts w:ascii="MS Gothic" w:eastAsia="MS Gothic" w:hAnsi="MS Gothic" w:cs="MS Gothic" w:hint="eastAsia"/>
-        </w:rPr>
-        <w:t>├</w:t>
-      </w:r>
-      <w:r>
-        <w:rPr>
-          <w:rFonts w:ascii="Calibri" w:hAnsi="Calibri" w:cs="Calibri"/>
-        </w:rPr>
-        <w:t>── Parts/</w:t>
-      </w:r>
-    </w:p>
-    <w:p>
-      <w:pPr>
-        <w:spacing w:after="0"/>
-        <w:rPr>
-          <w:rFonts w:ascii="Calibri" w:hAnsi="Calibri" w:cs="Calibri"/>
-        </w:rPr>
-      </w:pPr>
-      <w:r>
-        <w:rPr>
-          <w:rFonts w:ascii="Calibri" w:hAnsi="Calibri" w:cs="Calibri"/>
-        </w:rPr>
-        <w:t xml:space="preserve">│   </w:t>
-      </w:r>
-      <w:r>
-        <w:rPr>
-          <w:rFonts w:ascii="MS Gothic" w:eastAsia="MS Gothic" w:hAnsi="MS Gothic" w:cs="MS Gothic" w:hint="eastAsia"/>
-        </w:rPr>
-        <w:t>├</w:t>
-      </w:r>
-      <w:r>
-        <w:rPr>
-          <w:rFonts w:ascii="Calibri" w:hAnsi="Calibri" w:cs="Calibri"/>
-        </w:rPr>
-        <w:t>── Assemblies/</w:t>
-      </w:r>
-    </w:p>
-    <w:p>
-      <w:pPr>
-        <w:spacing w:after="0"/>
-        <w:rPr>
-          <w:rFonts w:ascii="Calibri" w:hAnsi="Calibri" w:cs="Calibri"/>
-        </w:rPr>
-      </w:pPr>
-      <w:r>
-        <w:rPr>
-          <w:rFonts w:ascii="Calibri" w:hAnsi="Calibri" w:cs="Calibri"/>
-        </w:rPr>
-        <w:t>│   └── Purchased/</w:t>
-      </w:r>
-    </w:p>
-    <w:p>
-      <w:pPr>
-        <w:spacing w:after="0"/>
-        <w:rPr>
-          <w:rFonts w:ascii="Calibri" w:hAnsi="Calibri" w:cs="Calibri"/>
-        </w:rPr>
-      </w:pPr>
-      <w:r>
-        <w:rPr>
-          <w:rFonts w:ascii="Calibri" w:hAnsi="Calibri" w:cs="Calibri"/>
-        </w:rPr>
-        <w:t>│</w:t>
-      </w:r>
-    </w:p>
-    <w:p>
-      <w:pPr>
-        <w:spacing w:after="0"/>
-        <w:rPr>
-          <w:rFonts w:ascii="Calibri" w:hAnsi="Calibri" w:cs="Calibri"/>
-        </w:rPr>
-      </w:pPr>
-      <w:r>
-        <w:rPr>
-          <w:rFonts w:ascii="MS Gothic" w:eastAsia="MS Gothic" w:hAnsi="MS Gothic" w:cs="MS Gothic" w:hint="eastAsia"/>
-        </w:rPr>
-        <w:t>├</w:t>
-      </w:r>
-      <w:r>
-        <w:rPr>
-          <w:rFonts w:ascii="Calibri" w:hAnsi="Calibri" w:cs="Calibri"/>
-        </w:rPr>
-        <w:t>── 70_AVIONICS_AND_ELECTRICAL/</w:t>
-      </w:r>
-    </w:p>
-    <w:p>
-      <w:pPr>
-        <w:spacing w:after="0"/>
-        <w:rPr>
-          <w:rFonts w:ascii="Calibri" w:hAnsi="Calibri" w:cs="Calibri"/>
-        </w:rPr>
-      </w:pPr>
-      <w:r>
-        <w:rPr>
-          <w:rFonts w:ascii="Calibri" w:hAnsi="Calibri" w:cs="Calibri"/>
-        </w:rPr>
-        <w:t xml:space="preserve">│   </w:t>
-      </w:r>
-      <w:r>
-        <w:rPr>
-          <w:rFonts w:ascii="MS Gothic" w:eastAsia="MS Gothic" w:hAnsi="MS Gothic" w:cs="MS Gothic" w:hint="eastAsia"/>
-        </w:rPr>
-        <w:t>├</w:t>
-      </w:r>
-      <w:r>
-        <w:rPr>
-          <w:rFonts w:ascii="Calibri" w:hAnsi="Calibri" w:cs="Calibri"/>
-        </w:rPr>
-        <w:t>── Parts/</w:t>
-      </w:r>
-    </w:p>
-    <w:p>
-      <w:pPr>
-        <w:spacing w:after="0"/>
-        <w:rPr>
-          <w:rFonts w:ascii="Calibri" w:hAnsi="Calibri" w:cs="Calibri"/>
-        </w:rPr>
-      </w:pPr>
-      <w:r>
-        <w:rPr>
-          <w:rFonts w:ascii="Calibri" w:hAnsi="Calibri" w:cs="Calibri"/>
-        </w:rPr>
-        <w:t xml:space="preserve">│   </w:t>
-      </w:r>
-      <w:r>
-        <w:rPr>
-          <w:rFonts w:ascii="MS Gothic" w:eastAsia="MS Gothic" w:hAnsi="MS Gothic" w:cs="MS Gothic" w:hint="eastAsia"/>
-        </w:rPr>
-        <w:t>├</w:t>
-      </w:r>
-      <w:r>
-        <w:rPr>
-          <w:rFonts w:ascii="Calibri" w:hAnsi="Calibri" w:cs="Calibri"/>
-        </w:rPr>
-        <w:t>── Assemblies/</w:t>
-      </w:r>
-    </w:p>
-    <w:p>
-      <w:pPr>
-        <w:spacing w:after="0"/>
-        <w:rPr>
-          <w:rFonts w:ascii="Calibri" w:hAnsi="Calibri" w:cs="Calibri"/>
-        </w:rPr>
-      </w:pPr>
-      <w:r>
-        <w:rPr>
-          <w:rFonts w:ascii="Calibri" w:hAnsi="Calibri" w:cs="Calibri"/>
-        </w:rPr>
-        <w:t>│   └── Purchased/</w:t>
-      </w:r>
-    </w:p>
-    <w:p>
-      <w:pPr>
-        <w:spacing w:after="0"/>
-        <w:rPr>
-          <w:rFonts w:ascii="Calibri" w:hAnsi="Calibri" w:cs="Calibri"/>
-        </w:rPr>
-      </w:pPr>
-      <w:r>
-        <w:rPr>
-          <w:rFonts w:ascii="Calibri" w:hAnsi="Calibri" w:cs="Calibri"/>
-        </w:rPr>
-        <w:t>│</w:t>
-      </w:r>
-    </w:p>
-    <w:p>
-      <w:pPr>
-        <w:spacing w:after="0"/>
-        <w:rPr>
-          <w:rFonts w:ascii="Calibri" w:hAnsi="Calibri" w:cs="Calibri"/>
-        </w:rPr>
-      </w:pPr>
-      <w:r>
-        <w:rPr>
-          <w:rFonts w:ascii="MS Gothic" w:eastAsia="MS Gothic" w:hAnsi="MS Gothic" w:cs="MS Gothic" w:hint="eastAsia"/>
-        </w:rPr>
-        <w:t>├</w:t>
-      </w:r>
-      <w:r>
-        <w:rPr>
-          <w:rFonts w:ascii="Calibri" w:hAnsi="Calibri" w:cs="Calibri"/>
-        </w:rPr>
-        <w:t>── 80_PAYLOAD/</w:t>
-      </w:r>
-    </w:p>
-    <w:p>
-      <w:pPr>
-        <w:spacing w:after="0"/>
-        <w:rPr>
-          <w:rFonts w:ascii="Calibri" w:hAnsi="Calibri" w:cs="Calibri"/>
-        </w:rPr>
-      </w:pPr>
-      <w:r>
-        <w:rPr>
-          <w:rFonts w:ascii="Calibri" w:hAnsi="Calibri" w:cs="Calibri"/>
-        </w:rPr>
-        <w:t xml:space="preserve">│   </w:t>
-      </w:r>
-      <w:r>
-        <w:rPr>
-          <w:rFonts w:ascii="MS Gothic" w:eastAsia="MS Gothic" w:hAnsi="MS Gothic" w:cs="MS Gothic" w:hint="eastAsia"/>
-        </w:rPr>
-        <w:t>├</w:t>
-      </w:r>
-      <w:r>
-        <w:rPr>
-          <w:rFonts w:ascii="Calibri" w:hAnsi="Calibri" w:cs="Calibri"/>
-        </w:rPr>
-        <w:t>── Parts/</w:t>
-      </w:r>
-    </w:p>
-    <w:p>
-      <w:pPr>
-        <w:spacing w:after="0"/>
-        <w:rPr>
-          <w:rFonts w:ascii="Calibri" w:hAnsi="Calibri" w:cs="Calibri"/>
-        </w:rPr>
-      </w:pPr>
-      <w:r>
-        <w:rPr>
-          <w:rFonts w:ascii="Calibri" w:hAnsi="Calibri" w:cs="Calibri"/>
-        </w:rPr>
-        <w:t xml:space="preserve">│   </w:t>
-      </w:r>
-      <w:r>
-        <w:rPr>
-          <w:rFonts w:ascii="MS Gothic" w:eastAsia="MS Gothic" w:hAnsi="MS Gothic" w:cs="MS Gothic" w:hint="eastAsia"/>
-        </w:rPr>
-        <w:t>├</w:t>
-      </w:r>
-      <w:r>
-        <w:rPr>
-          <w:rFonts w:ascii="Calibri" w:hAnsi="Calibri" w:cs="Calibri"/>
-        </w:rPr>
-        <w:t>── Assemblies/</w:t>
-      </w:r>
-    </w:p>
-    <w:p>
-      <w:pPr>
-        <w:spacing w:after="0"/>
-        <w:rPr>
-          <w:rFonts w:ascii="Calibri" w:hAnsi="Calibri" w:cs="Calibri"/>
-        </w:rPr>
-      </w:pPr>
-      <w:r>
-        <w:rPr>
-          <w:rFonts w:ascii="Calibri" w:hAnsi="Calibri" w:cs="Calibri"/>
-        </w:rPr>
-        <w:t>│   └── Purchased/</w:t>
-      </w:r>
-    </w:p>
-    <w:p>
-      <w:pPr>
-        <w:spacing w:after="0"/>
-        <w:rPr>
-          <w:rFonts w:ascii="Calibri" w:hAnsi="Calibri" w:cs="Calibri"/>
-        </w:rPr>
-      </w:pPr>
-      <w:r>
-        <w:rPr>
-          <w:rFonts w:ascii="Calibri" w:hAnsi="Calibri" w:cs="Calibri"/>
-        </w:rPr>
-        <w:t>│</w:t>
-      </w:r>
-    </w:p>
-    <w:p>
-      <w:pPr>
-        <w:spacing w:after="0"/>
-        <w:rPr>
-          <w:rFonts w:ascii="Calibri" w:hAnsi="Calibri" w:cs="Calibri"/>
-        </w:rPr>
-      </w:pPr>
-      <w:r>
-        <w:rPr>
-          <w:rFonts w:ascii="MS Gothic" w:eastAsia="MS Gothic" w:hAnsi="MS Gothic" w:cs="MS Gothic" w:hint="eastAsia"/>
-        </w:rPr>
-        <w:lastRenderedPageBreak/>
-        <w:t>├</w:t>
-      </w:r>
-      <w:r>
-        <w:rPr>
-          <w:rFonts w:ascii="Calibri" w:hAnsi="Calibri" w:cs="Calibri"/>
-        </w:rPr>
-        <w:t>── 90_COMMON_HARDWARE/</w:t>
-      </w:r>
-    </w:p>
-    <w:p>
-      <w:pPr>
-        <w:spacing w:after="0"/>
-        <w:rPr>
-          <w:rFonts w:ascii="Calibri" w:hAnsi="Calibri" w:cs="Calibri"/>
-        </w:rPr>
-      </w:pPr>
-      <w:r>
-        <w:rPr>
-          <w:rFonts w:ascii="MS Gothic" w:eastAsia="MS Gothic" w:hAnsi="MS Gothic" w:cs="MS Gothic" w:hint="eastAsia"/>
-        </w:rPr>
-        <w:t>├</w:t>
-      </w:r>
-      <w:r>
-        <w:rPr>
-          <w:rFonts w:ascii="Calibri" w:hAnsi="Calibri" w:cs="Calibri"/>
-        </w:rPr>
-        <w:t>── 91_DRAWINGS/</w:t>
-      </w:r>
-    </w:p>
-    <w:p>
-      <w:pPr>
-        <w:spacing w:after="0"/>
-        <w:rPr>
-          <w:rFonts w:ascii="Calibri" w:hAnsi="Calibri" w:cs="Calibri"/>
-        </w:rPr>
-      </w:pPr>
-      <w:r>
-        <w:rPr>
-          <w:rFonts w:ascii="MS Gothic" w:eastAsia="MS Gothic" w:hAnsi="MS Gothic" w:cs="MS Gothic" w:hint="eastAsia"/>
-        </w:rPr>
-        <w:t>├</w:t>
-      </w:r>
-      <w:r>
-        <w:rPr>
-          <w:rFonts w:ascii="Calibri" w:hAnsi="Calibri" w:cs="Calibri"/>
-        </w:rPr>
-        <w:t>── 92_EXPORTS/</w:t>
-      </w:r>
-    </w:p>
-    <w:p>
-      <w:pPr>
-        <w:spacing w:after="0"/>
-        <w:rPr>
-          <w:rFonts w:ascii="Calibri" w:hAnsi="Calibri" w:cs="Calibri"/>
-        </w:rPr>
-      </w:pPr>
-      <w:r>
-        <w:rPr>
-          <w:rFonts w:ascii="MS Gothic" w:eastAsia="MS Gothic" w:hAnsi="MS Gothic" w:cs="MS Gothic" w:hint="eastAsia"/>
-        </w:rPr>
-        <w:t>├</w:t>
-      </w:r>
-      <w:r>
-        <w:rPr>
-          <w:rFonts w:ascii="Calibri" w:hAnsi="Calibri" w:cs="Calibri"/>
-        </w:rPr>
-        <w:t>── 93_DOCUMENTATION/</w:t>
-      </w:r>
-    </w:p>
-    <w:p>
-      <w:pPr>
-        <w:spacing w:after="0"/>
-        <w:rPr>
-          <w:rFonts w:ascii="Calibri" w:hAnsi="Calibri" w:cs="Calibri"/>
-        </w:rPr>
-      </w:pPr>
-      <w:r>
-        <w:rPr>
-          <w:rFonts w:ascii="Calibri" w:hAnsi="Calibri" w:cs="Calibri"/>
-        </w:rPr>
-        <w:t>└── 99_ARCHIVE/</w:t>
-      </w:r>
-    </w:p>
-    <w:p>
-      <w:pPr>
-        <w:rPr>
-          <w:rFonts w:ascii="Calibri" w:hAnsi="Calibri" w:cs="Calibri"/>
-        </w:rPr>
-      </w:pPr>
-      <w:r>
-        <w:rPr>
-          <w:rFonts w:ascii="Calibri" w:hAnsi="Calibri" w:cs="Calibri"/>
-        </w:rPr>
-        <w:t>All active files shall be stored inside this structure.</w:t>
-      </w:r>
-    </w:p>
-    <w:p>
-      <w:pPr>
-        <w:spacing w:after="0"/>
-        <w:rPr>
-          <w:rFonts w:ascii="Calibri" w:hAnsi="Calibri" w:cs="Calibri"/>
-        </w:rPr>
-      </w:pPr>
-      <w:r>
-        <w:rPr>
-          <w:rFonts w:ascii="Calibri" w:hAnsi="Calibri" w:cs="Calibri"/>
-        </w:rPr>
-        <w:t>Files shall not be referenced from:</w:t>
-      </w:r>
-    </w:p>
-    <w:p>
-      <w:pPr>
-        <w:pStyle w:val="ListParagraph"/>
-        <w:numPr>
-          <w:ilvl w:val="0"/>
-          <w:numId w:val="15"/>
-        </w:numPr>
-        <w:rPr>
-          <w:rFonts w:ascii="Calibri" w:hAnsi="Calibri" w:cs="Calibri"/>
-        </w:rPr>
-      </w:pPr>
-      <w:r>
-        <w:rPr>
-          <w:rFonts w:ascii="Calibri" w:hAnsi="Calibri" w:cs="Calibri"/>
-        </w:rPr>
-        <w:t>Desktop;</w:t>
-      </w:r>
-    </w:p>
-    <w:p>
-      <w:pPr>
-        <w:pStyle w:val="ListParagraph"/>
-        <w:numPr>
-          <w:ilvl w:val="0"/>
-          <w:numId w:val="15"/>
-        </w:numPr>
-        <w:rPr>
-          <w:rFonts w:ascii="Calibri" w:hAnsi="Calibri" w:cs="Calibri"/>
-        </w:rPr>
-      </w:pPr>
-      <w:r>
-        <w:rPr>
-          <w:rFonts w:ascii="Calibri" w:hAnsi="Calibri" w:cs="Calibri"/>
-        </w:rPr>
-        <w:t>Downloads;</w:t>
-      </w:r>
-    </w:p>
-    <w:p>
-      <w:pPr>
-        <w:pStyle w:val="ListParagraph"/>
-        <w:numPr>
-          <w:ilvl w:val="0"/>
-          <w:numId w:val="15"/>
-        </w:numPr>
-        <w:rPr>
-          <w:rFonts w:ascii="Calibri" w:hAnsi="Calibri" w:cs="Calibri"/>
-        </w:rPr>
-      </w:pPr>
-      <w:r>
-        <w:rPr>
-          <w:rFonts w:ascii="Calibri" w:hAnsi="Calibri" w:cs="Calibri"/>
-        </w:rPr>
-        <w:t>email attachments;</w:t>
-      </w:r>
-    </w:p>
-    <w:p>
-      <w:pPr>
-        <w:pStyle w:val="ListParagraph"/>
-        <w:numPr>
-          <w:ilvl w:val="0"/>
-          <w:numId w:val="15"/>
-        </w:numPr>
-        <w:rPr>
-          <w:rFonts w:ascii="Calibri" w:hAnsi="Calibri" w:cs="Calibri"/>
-        </w:rPr>
-      </w:pPr>
-      <w:r>
-        <w:rPr>
-          <w:rFonts w:ascii="Calibri" w:hAnsi="Calibri" w:cs="Calibri"/>
-        </w:rPr>
-        <w:t>personal folders;</w:t>
-      </w:r>
-    </w:p>
-    <w:p>
-      <w:pPr>
-        <w:pStyle w:val="ListParagraph"/>
-        <w:numPr>
-          <w:ilvl w:val="0"/>
-          <w:numId w:val="15"/>
-        </w:numPr>
-        <w:rPr>
-          <w:rFonts w:ascii="Calibri" w:hAnsi="Calibri" w:cs="Calibri"/>
-        </w:rPr>
-      </w:pPr>
-      <w:r>
-        <w:rPr>
-          <w:rFonts w:ascii="Calibri" w:hAnsi="Calibri" w:cs="Calibri"/>
-        </w:rPr>
-        <w:t>temporary folders;</w:t>
-      </w:r>
-    </w:p>
-    <w:p>
-      <w:pPr>
-        <w:pStyle w:val="ListParagraph"/>
-        <w:numPr>
-          <w:ilvl w:val="0"/>
-          <w:numId w:val="15"/>
-        </w:numPr>
-        <w:rPr>
-          <w:rFonts w:ascii="Calibri" w:hAnsi="Calibri" w:cs="Calibri"/>
-        </w:rPr>
-      </w:pPr>
-      <w:r>
-        <w:rPr>
-          <w:rFonts w:ascii="Calibri" w:hAnsi="Calibri" w:cs="Calibri"/>
-        </w:rPr>
-        <w:t>USB drives;</w:t>
-      </w:r>
-    </w:p>
-    <w:p>
-      <w:pPr>
-        <w:pStyle w:val="ListParagraph"/>
-        <w:numPr>
-          <w:ilvl w:val="0"/>
-          <w:numId w:val="15"/>
-        </w:numPr>
-        <w:rPr>
-          <w:rFonts w:ascii="Calibri" w:hAnsi="Calibri" w:cs="Calibri"/>
-        </w:rPr>
-      </w:pPr>
-      <w:r>
-        <w:rPr>
-          <w:rFonts w:ascii="Calibri" w:hAnsi="Calibri" w:cs="Calibri"/>
-        </w:rPr>
-        <w:t>old project folders.</w:t>
-      </w:r>
-    </w:p>
-    <w:p>
-      <w:pPr>
-        <w:rPr>
-          <w:rFonts w:ascii="Calibri" w:hAnsi="Calibri" w:cs="Calibri"/>
-        </w:rPr>
-      </w:pPr>
-      <w:r>
-        <w:rPr>
-          <w:rFonts w:ascii="Calibri" w:hAnsi="Calibri" w:cs="Calibri"/>
-        </w:rPr>
-        <w:br w:type="page"/>
-      </w:r>
-    </w:p>
-    <w:p>
-      <w:pPr>
-        <w:pStyle w:val="Heading2"/>
-        <w:numPr>
-          <w:ilvl w:val="0"/>
-          <w:numId w:val="13"/>
-        </w:numPr>
-        <w:rPr>
-          <w:rFonts w:ascii="Calibri" w:hAnsi="Calibri" w:cs="Calibri"/>
-        </w:rPr>
-      </w:pPr>
-      <w:r>
-        <w:rPr>
-          <w:rFonts w:ascii="Calibri" w:hAnsi="Calibri" w:cs="Calibri"/>
-        </w:rPr>
-        <w:lastRenderedPageBreak/>
-        <w:t>Folder usage</w:t>
-      </w:r>
-    </w:p>
-    <w:p>
-      <w:pPr>
-        <w:rPr>
-          <w:rFonts w:ascii="Calibri" w:hAnsi="Calibri" w:cs="Calibri"/>
           <w:b/>
           <w:bCs/>
+          <w:lang w:val="bg-BG"/>
         </w:rPr>
       </w:pPr>
       <w:r>
@@ -1622,655 +611,88 @@
           <w:b/>
           <w:bCs/>
         </w:rPr>
-        <w:t>00_TOP_LEVEL</w:t>
-      </w:r>
-    </w:p>
-    <w:p>
-      <w:pPr>
-        <w:rPr>
-          <w:rFonts w:ascii="Calibri" w:hAnsi="Calibri" w:cs="Calibri"/>
-        </w:rPr>
-      </w:pPr>
-      <w:r>
-        <w:rPr>
-          <w:rFonts w:ascii="Calibri" w:hAnsi="Calibri" w:cs="Calibri"/>
-        </w:rPr>
-        <w:t>Contains the complete aircraft assembly and other full-aircraft configurations.</w:t>
-      </w:r>
-    </w:p>
-    <w:p>
-      <w:pPr>
-        <w:spacing w:after="0"/>
-        <w:rPr>
-          <w:rFonts w:ascii="Calibri" w:hAnsi="Calibri" w:cs="Calibri"/>
-          <w:i/>
-          <w:iCs/>
-        </w:rPr>
-      </w:pPr>
-      <w:r>
-        <w:rPr>
-          <w:rFonts w:ascii="Calibri" w:hAnsi="Calibri" w:cs="Calibri"/>
-          <w:i/>
-          <w:iCs/>
-        </w:rPr>
-        <w:t>Example:</w:t>
-      </w:r>
-    </w:p>
-    <w:p>
-      <w:pPr>
-        <w:rPr>
-          <w:rFonts w:ascii="Calibri" w:hAnsi="Calibri" w:cs="Calibri"/>
-          <w:i/>
-          <w:iCs/>
-        </w:rPr>
-      </w:pPr>
-      <w:r>
-        <w:rPr>
-          <w:rFonts w:ascii="Calibri" w:hAnsi="Calibri" w:cs="Calibri"/>
-          <w:i/>
-          <w:iCs/>
-        </w:rPr>
-        <w:t>OF-P01-TOP-000-20260723-TOP_LEVEL.SLDASM</w:t>
-      </w:r>
-    </w:p>
-    <w:p>
-      <w:pPr>
-        <w:spacing w:after="0"/>
-        <w:rPr>
-          <w:rFonts w:ascii="Calibri" w:hAnsi="Calibri" w:cs="Calibri"/>
-          <w:i/>
-          <w:iCs/>
-        </w:rPr>
-      </w:pPr>
-      <w:r>
-        <w:rPr>
-          <w:rFonts w:ascii="Calibri" w:hAnsi="Calibri" w:cs="Calibri"/>
-          <w:i/>
-          <w:iCs/>
-        </w:rPr>
-        <w:t>Possible additional assemblies include:</w:t>
-      </w:r>
-    </w:p>
-    <w:p>
-      <w:pPr>
-        <w:spacing w:after="0"/>
-        <w:rPr>
-          <w:rFonts w:ascii="Calibri" w:hAnsi="Calibri" w:cs="Calibri"/>
-          <w:i/>
-          <w:iCs/>
-        </w:rPr>
-      </w:pPr>
-      <w:r>
-        <w:rPr>
-          <w:rFonts w:ascii="Calibri" w:hAnsi="Calibri" w:cs="Calibri"/>
-          <w:i/>
-          <w:iCs/>
-        </w:rPr>
-        <w:t>OF-P01-TOP-010-20260723-FLIGHT_CONFIGURATION.SLDASM</w:t>
-      </w:r>
-    </w:p>
-    <w:p>
-      <w:pPr>
-        <w:rPr>
-          <w:rFonts w:ascii="Calibri" w:hAnsi="Calibri" w:cs="Calibri"/>
-          <w:i/>
-          <w:iCs/>
-        </w:rPr>
-      </w:pPr>
-      <w:r>
-        <w:rPr>
-          <w:rFonts w:ascii="Calibri" w:hAnsi="Calibri" w:cs="Calibri"/>
-          <w:i/>
-          <w:iCs/>
-        </w:rPr>
-        <w:t>OF-P01-TOP-020-20260723-TRANSPORT_CONFIGURATION.SLDASM</w:t>
-      </w:r>
-    </w:p>
-    <w:p>
-      <w:pPr>
+        <w:t>ORGOFLY_PROTOTYPE_01</w:t>
+      </w:r>
+      <w:r>
         <w:rPr>
           <w:rFonts w:ascii="Calibri" w:hAnsi="Calibri" w:cs="Calibri"/>
           <w:b/>
           <w:bCs/>
         </w:rPr>
-      </w:pPr>
-      <w:r>
+        <w:t>_CAD</w:t>
+      </w:r>
+    </w:p>
+    <w:p>
+      <w:pPr>
+        <w:spacing w:after="0"/>
         <w:rPr>
           <w:rFonts w:ascii="Calibri" w:hAnsi="Calibri" w:cs="Calibri"/>
           <w:b/>
           <w:bCs/>
         </w:rPr>
-        <w:t>10_MASTER_GEOMETRY</w:t>
-      </w:r>
-    </w:p>
-    <w:p>
-      <w:pPr>
-        <w:spacing w:after="0"/>
-        <w:rPr>
-          <w:rFonts w:ascii="Calibri" w:hAnsi="Calibri" w:cs="Calibri"/>
-        </w:rPr>
-      </w:pPr>
-      <w:r>
-        <w:rPr>
-          <w:rFonts w:ascii="Calibri" w:hAnsi="Calibri" w:cs="Calibri"/>
-        </w:rPr>
-        <w:t>Contains the reference geometry controlling the aircraft layout, such as:</w:t>
-      </w:r>
-    </w:p>
-    <w:p>
-      <w:pPr>
-        <w:pStyle w:val="ListParagraph"/>
-        <w:numPr>
-          <w:ilvl w:val="0"/>
-          <w:numId w:val="16"/>
-        </w:numPr>
-        <w:rPr>
-          <w:rFonts w:ascii="Calibri" w:hAnsi="Calibri" w:cs="Calibri"/>
-        </w:rPr>
-      </w:pPr>
-      <w:r>
-        <w:rPr>
-          <w:rFonts w:ascii="Calibri" w:hAnsi="Calibri" w:cs="Calibri"/>
-        </w:rPr>
-        <w:t>aircraft centreline;</w:t>
-      </w:r>
-    </w:p>
-    <w:p>
-      <w:pPr>
-        <w:pStyle w:val="ListParagraph"/>
-        <w:numPr>
-          <w:ilvl w:val="0"/>
-          <w:numId w:val="16"/>
-        </w:numPr>
-        <w:rPr>
-          <w:rFonts w:ascii="Calibri" w:hAnsi="Calibri" w:cs="Calibri"/>
-        </w:rPr>
-      </w:pPr>
-      <w:r>
-        <w:rPr>
-          <w:rFonts w:ascii="Calibri" w:hAnsi="Calibri" w:cs="Calibri"/>
-        </w:rPr>
-        <w:t xml:space="preserve">wing planform and </w:t>
-      </w:r>
-      <w:proofErr w:type="spellStart"/>
-      <w:r>
-        <w:rPr>
-          <w:rFonts w:ascii="Calibri" w:hAnsi="Calibri" w:cs="Calibri"/>
-        </w:rPr>
-        <w:t>airfoils</w:t>
-      </w:r>
-      <w:proofErr w:type="spellEnd"/>
-      <w:r>
-        <w:rPr>
-          <w:rFonts w:ascii="Calibri" w:hAnsi="Calibri" w:cs="Calibri"/>
-        </w:rPr>
-        <w:t>;</w:t>
-      </w:r>
-    </w:p>
-    <w:p>
-      <w:pPr>
-        <w:pStyle w:val="ListParagraph"/>
-        <w:numPr>
-          <w:ilvl w:val="0"/>
-          <w:numId w:val="16"/>
-        </w:numPr>
-        <w:rPr>
-          <w:rFonts w:ascii="Calibri" w:hAnsi="Calibri" w:cs="Calibri"/>
-        </w:rPr>
-      </w:pPr>
-      <w:r>
-        <w:rPr>
-          <w:rFonts w:ascii="Calibri" w:hAnsi="Calibri" w:cs="Calibri"/>
-        </w:rPr>
-        <w:t>fuselage envelope;</w:t>
-      </w:r>
-    </w:p>
-    <w:p>
-      <w:pPr>
-        <w:pStyle w:val="ListParagraph"/>
-        <w:numPr>
-          <w:ilvl w:val="0"/>
-          <w:numId w:val="16"/>
-        </w:numPr>
-        <w:rPr>
-          <w:rFonts w:ascii="Calibri" w:hAnsi="Calibri" w:cs="Calibri"/>
-        </w:rPr>
-      </w:pPr>
-      <w:r>
-        <w:rPr>
-          <w:rFonts w:ascii="Calibri" w:hAnsi="Calibri" w:cs="Calibri"/>
-        </w:rPr>
-        <w:t>tail position;</w:t>
-      </w:r>
-    </w:p>
-    <w:p>
-      <w:pPr>
-        <w:pStyle w:val="ListParagraph"/>
-        <w:numPr>
-          <w:ilvl w:val="0"/>
-          <w:numId w:val="16"/>
-        </w:numPr>
-        <w:rPr>
-          <w:rFonts w:ascii="Calibri" w:hAnsi="Calibri" w:cs="Calibri"/>
-        </w:rPr>
-      </w:pPr>
-      <w:r>
-        <w:rPr>
-          <w:rFonts w:ascii="Calibri" w:hAnsi="Calibri" w:cs="Calibri"/>
-        </w:rPr>
-        <w:t>rotor and tilt axes;</w:t>
-      </w:r>
-    </w:p>
-    <w:p>
-      <w:pPr>
-        <w:pStyle w:val="ListParagraph"/>
-        <w:numPr>
-          <w:ilvl w:val="0"/>
-          <w:numId w:val="16"/>
-        </w:numPr>
-        <w:rPr>
-          <w:rFonts w:ascii="Calibri" w:hAnsi="Calibri" w:cs="Calibri"/>
-        </w:rPr>
-      </w:pPr>
-      <w:r>
-        <w:rPr>
-          <w:rFonts w:ascii="Calibri" w:hAnsi="Calibri" w:cs="Calibri"/>
-        </w:rPr>
-        <w:t>major interface planes.</w:t>
-      </w:r>
-    </w:p>
-    <w:p>
-      <w:pPr>
-        <w:rPr>
-          <w:rFonts w:ascii="Calibri" w:hAnsi="Calibri" w:cs="Calibri"/>
-        </w:rPr>
-      </w:pPr>
-      <w:r>
-        <w:rPr>
-          <w:rFonts w:ascii="Calibri" w:hAnsi="Calibri" w:cs="Calibri"/>
-        </w:rPr>
-        <w:t>These files define geometry but are not normally manufactured parts.</w:t>
-      </w:r>
-    </w:p>
-    <w:p>
-      <w:pPr>
+      </w:pPr>
+      <w:r>
         <w:rPr>
           <w:rFonts w:ascii="Calibri" w:hAnsi="Calibri" w:cs="Calibri"/>
           <w:b/>
           <w:bCs/>
         </w:rPr>
-      </w:pPr>
+        <w:t>1</w:t>
+      </w:r>
       <w:r>
         <w:rPr>
           <w:rFonts w:ascii="Calibri" w:hAnsi="Calibri" w:cs="Calibri"/>
           <w:b/>
           <w:bCs/>
-        </w:rPr>
-        <w:t>Subsystem folders</w:t>
-      </w:r>
-    </w:p>
-    <w:p>
-      <w:pPr>
-        <w:spacing w:after="0"/>
-        <w:rPr>
-          <w:rFonts w:ascii="Calibri" w:hAnsi="Calibri" w:cs="Calibri"/>
-        </w:rPr>
-      </w:pPr>
-      <w:r>
-        <w:rPr>
-          <w:rFonts w:ascii="Calibri" w:hAnsi="Calibri" w:cs="Calibri"/>
-        </w:rPr>
-        <w:t>The fuselage, wing, tail, propulsion, landing gear, avionics, and payload folders contain the parts and assemblies belonging to those systems.</w:t>
-      </w:r>
-    </w:p>
-    <w:p>
-      <w:pPr>
-        <w:rPr>
-          <w:rFonts w:ascii="Calibri" w:hAnsi="Calibri" w:cs="Calibri"/>
-        </w:rPr>
-      </w:pPr>
-      <w:r>
-        <w:rPr>
-          <w:rFonts w:ascii="Calibri" w:hAnsi="Calibri" w:cs="Calibri"/>
-        </w:rPr>
-        <w:t>A component shall be stored according to where it is primarily used.</w:t>
-      </w:r>
-    </w:p>
-    <w:p>
-      <w:pPr>
-        <w:spacing w:after="0"/>
-        <w:rPr>
-          <w:rFonts w:ascii="Calibri" w:hAnsi="Calibri" w:cs="Calibri"/>
-          <w:i/>
-          <w:iCs/>
-        </w:rPr>
-      </w:pPr>
-      <w:r>
-        <w:rPr>
-          <w:rFonts w:ascii="Calibri" w:hAnsi="Calibri" w:cs="Calibri"/>
-          <w:i/>
-          <w:iCs/>
-        </w:rPr>
-        <w:t>Examples:</w:t>
-      </w:r>
-    </w:p>
-    <w:p>
-      <w:pPr>
-        <w:spacing w:after="0"/>
-        <w:rPr>
-          <w:rFonts w:ascii="Calibri" w:hAnsi="Calibri" w:cs="Calibri"/>
-          <w:i/>
-          <w:iCs/>
-        </w:rPr>
-      </w:pPr>
-      <w:r>
-        <w:rPr>
-          <w:rFonts w:ascii="Calibri" w:hAnsi="Calibri" w:cs="Calibri"/>
-          <w:i/>
-          <w:iCs/>
-        </w:rPr>
-        <w:t>Wing servo bracket</w:t>
-      </w:r>
-    </w:p>
-    <w:p>
-      <w:pPr>
-        <w:spacing w:after="0"/>
-        <w:rPr>
-          <w:rFonts w:ascii="Calibri" w:hAnsi="Calibri" w:cs="Calibri"/>
-          <w:i/>
-          <w:iCs/>
-        </w:rPr>
-      </w:pPr>
-      <w:r>
-        <w:rPr>
-          <w:rFonts w:ascii="Calibri" w:hAnsi="Calibri" w:cs="Calibri"/>
-          <w:i/>
-          <w:iCs/>
-        </w:rPr>
-        <w:t>→ 30_WING/Parts/</w:t>
-      </w:r>
-    </w:p>
-    <w:p>
-      <w:pPr>
-        <w:spacing w:after="0"/>
-        <w:rPr>
-          <w:rFonts w:ascii="Calibri" w:hAnsi="Calibri" w:cs="Calibri"/>
-          <w:i/>
-          <w:iCs/>
-        </w:rPr>
-      </w:pPr>
-      <w:r>
-        <w:rPr>
-          <w:rFonts w:ascii="Calibri" w:hAnsi="Calibri" w:cs="Calibri"/>
-          <w:i/>
-          <w:iCs/>
-        </w:rPr>
-        <w:t>Motor mount</w:t>
-      </w:r>
-    </w:p>
-    <w:p>
-      <w:pPr>
-        <w:spacing w:after="0"/>
-        <w:rPr>
-          <w:rFonts w:ascii="Calibri" w:hAnsi="Calibri" w:cs="Calibri"/>
-          <w:i/>
-          <w:iCs/>
-        </w:rPr>
-      </w:pPr>
-      <w:r>
-        <w:rPr>
-          <w:rFonts w:ascii="Calibri" w:hAnsi="Calibri" w:cs="Calibri"/>
-          <w:i/>
-          <w:iCs/>
-        </w:rPr>
-        <w:t>→ 50_PROPULSION_AND_TILT/Parts/</w:t>
-      </w:r>
-    </w:p>
-    <w:p>
-      <w:pPr>
-        <w:spacing w:after="0"/>
-        <w:rPr>
-          <w:rFonts w:ascii="Calibri" w:hAnsi="Calibri" w:cs="Calibri"/>
-          <w:i/>
-          <w:iCs/>
-        </w:rPr>
-      </w:pPr>
-      <w:r>
-        <w:rPr>
-          <w:rFonts w:ascii="Calibri" w:hAnsi="Calibri" w:cs="Calibri"/>
-          <w:i/>
-          <w:iCs/>
-        </w:rPr>
-        <w:t>Flight-controller tray</w:t>
-      </w:r>
-    </w:p>
-    <w:p>
-      <w:pPr>
-        <w:rPr>
-          <w:rFonts w:ascii="Calibri" w:hAnsi="Calibri" w:cs="Calibri"/>
-          <w:i/>
-          <w:iCs/>
-        </w:rPr>
-      </w:pPr>
-      <w:r>
-        <w:rPr>
-          <w:rFonts w:ascii="Calibri" w:hAnsi="Calibri" w:cs="Calibri"/>
-          <w:i/>
-          <w:iCs/>
-        </w:rPr>
-        <w:t>→ 70_AVIONICS_AND_ELECTRICAL/Parts/</w:t>
-      </w:r>
-    </w:p>
-    <w:p>
-      <w:pPr>
-        <w:spacing w:after="120"/>
+          <w:lang w:val="bg-BG"/>
+        </w:rPr>
+        <w:t>0_</w:t>
+      </w:r>
+      <w:r>
         <w:rPr>
           <w:rFonts w:ascii="Calibri" w:hAnsi="Calibri" w:cs="Calibri"/>
           <w:b/>
           <w:bCs/>
         </w:rPr>
-      </w:pPr>
-      <w:r>
+        <w:t>GENERAL (Master geometry goes into general)</w:t>
+      </w:r>
+    </w:p>
+    <w:p>
+      <w:pPr>
+        <w:spacing w:after="0"/>
         <w:rPr>
           <w:rFonts w:ascii="Calibri" w:hAnsi="Calibri" w:cs="Calibri"/>
           <w:b/>
           <w:bCs/>
-        </w:rPr>
-        <w:t>90_COMMON_HARDWARE</w:t>
-      </w:r>
-    </w:p>
-    <w:p>
-      <w:pPr>
-        <w:spacing w:after="0"/>
-        <w:rPr>
-          <w:rFonts w:ascii="Calibri" w:hAnsi="Calibri" w:cs="Calibri"/>
-        </w:rPr>
-      </w:pPr>
-      <w:r>
-        <w:rPr>
-          <w:rFonts w:ascii="Calibri" w:hAnsi="Calibri" w:cs="Calibri"/>
-        </w:rPr>
-        <w:t>Contains reusable standard components used in multiple systems, such as:</w:t>
-      </w:r>
-    </w:p>
-    <w:p>
-      <w:pPr>
-        <w:pStyle w:val="ListParagraph"/>
-        <w:numPr>
-          <w:ilvl w:val="0"/>
-          <w:numId w:val="6"/>
-        </w:numPr>
-        <w:rPr>
-          <w:rFonts w:ascii="Calibri" w:hAnsi="Calibri" w:cs="Calibri"/>
-        </w:rPr>
-      </w:pPr>
-      <w:r>
-        <w:rPr>
-          <w:rFonts w:ascii="Calibri" w:hAnsi="Calibri" w:cs="Calibri"/>
-        </w:rPr>
-        <w:t>fasteners;</w:t>
-      </w:r>
-    </w:p>
-    <w:p>
-      <w:pPr>
-        <w:pStyle w:val="ListParagraph"/>
-        <w:numPr>
-          <w:ilvl w:val="0"/>
-          <w:numId w:val="6"/>
-        </w:numPr>
-        <w:rPr>
-          <w:rFonts w:ascii="Calibri" w:hAnsi="Calibri" w:cs="Calibri"/>
-        </w:rPr>
-      </w:pPr>
-      <w:r>
-        <w:rPr>
-          <w:rFonts w:ascii="Calibri" w:hAnsi="Calibri" w:cs="Calibri"/>
-        </w:rPr>
-        <w:t>nuts and washers;</w:t>
-      </w:r>
-    </w:p>
-    <w:p>
-      <w:pPr>
-        <w:pStyle w:val="ListParagraph"/>
-        <w:numPr>
-          <w:ilvl w:val="0"/>
-          <w:numId w:val="6"/>
-        </w:numPr>
-        <w:rPr>
-          <w:rFonts w:ascii="Calibri" w:hAnsi="Calibri" w:cs="Calibri"/>
-        </w:rPr>
-      </w:pPr>
-      <w:r>
-        <w:rPr>
-          <w:rFonts w:ascii="Calibri" w:hAnsi="Calibri" w:cs="Calibri"/>
-        </w:rPr>
-        <w:t>bearings;</w:t>
-      </w:r>
-    </w:p>
-    <w:p>
-      <w:pPr>
-        <w:pStyle w:val="ListParagraph"/>
-        <w:numPr>
-          <w:ilvl w:val="0"/>
-          <w:numId w:val="6"/>
-        </w:numPr>
-        <w:rPr>
-          <w:rFonts w:ascii="Calibri" w:hAnsi="Calibri" w:cs="Calibri"/>
-        </w:rPr>
-      </w:pPr>
-      <w:r>
-        <w:rPr>
-          <w:rFonts w:ascii="Calibri" w:hAnsi="Calibri" w:cs="Calibri"/>
-        </w:rPr>
-        <w:t>bushings;</w:t>
-      </w:r>
-    </w:p>
-    <w:p>
-      <w:pPr>
-        <w:pStyle w:val="ListParagraph"/>
-        <w:numPr>
-          <w:ilvl w:val="0"/>
-          <w:numId w:val="6"/>
-        </w:numPr>
-        <w:rPr>
-          <w:rFonts w:ascii="Calibri" w:hAnsi="Calibri" w:cs="Calibri"/>
-        </w:rPr>
-      </w:pPr>
-      <w:r>
-        <w:rPr>
-          <w:rFonts w:ascii="Calibri" w:hAnsi="Calibri" w:cs="Calibri"/>
-        </w:rPr>
-        <w:t>pins;</w:t>
-      </w:r>
-    </w:p>
-    <w:p>
-      <w:pPr>
-        <w:pStyle w:val="ListParagraph"/>
-        <w:numPr>
-          <w:ilvl w:val="0"/>
-          <w:numId w:val="6"/>
-        </w:numPr>
-        <w:rPr>
-          <w:rFonts w:ascii="Calibri" w:hAnsi="Calibri" w:cs="Calibri"/>
-        </w:rPr>
-      </w:pPr>
-      <w:r>
-        <w:rPr>
-          <w:rFonts w:ascii="Calibri" w:hAnsi="Calibri" w:cs="Calibri"/>
-        </w:rPr>
-        <w:lastRenderedPageBreak/>
-        <w:t>standard profiles;</w:t>
-      </w:r>
-    </w:p>
-    <w:p>
-      <w:pPr>
-        <w:pStyle w:val="ListParagraph"/>
-        <w:numPr>
-          <w:ilvl w:val="0"/>
-          <w:numId w:val="6"/>
-        </w:numPr>
-        <w:rPr>
-          <w:rFonts w:ascii="Calibri" w:hAnsi="Calibri" w:cs="Calibri"/>
-        </w:rPr>
-      </w:pPr>
-      <w:r>
-        <w:rPr>
-          <w:rFonts w:ascii="Calibri" w:hAnsi="Calibri" w:cs="Calibri"/>
-        </w:rPr>
-        <w:t>common connectors.</w:t>
-      </w:r>
-    </w:p>
-    <w:p>
-      <w:pPr>
-        <w:rPr>
-          <w:rFonts w:ascii="Calibri" w:hAnsi="Calibri" w:cs="Calibri"/>
-        </w:rPr>
-      </w:pPr>
-      <w:r>
-        <w:rPr>
-          <w:rFonts w:ascii="Calibri" w:hAnsi="Calibri" w:cs="Calibri"/>
-        </w:rPr>
-        <w:t>The same standard component shall be stored only once.</w:t>
-      </w:r>
-    </w:p>
-    <w:p>
-      <w:pPr>
-        <w:spacing w:after="120"/>
+          <w:lang w:val="bg-BG"/>
+        </w:rPr>
+      </w:pPr>
+      <w:r>
         <w:rPr>
           <w:rFonts w:ascii="Calibri" w:hAnsi="Calibri" w:cs="Calibri"/>
           <w:b/>
           <w:bCs/>
-        </w:rPr>
-      </w:pPr>
+          <w:lang w:val="bg-BG"/>
+        </w:rPr>
+        <w:t>20_</w:t>
+      </w:r>
       <w:r>
         <w:rPr>
           <w:rFonts w:ascii="Calibri" w:hAnsi="Calibri" w:cs="Calibri"/>
           <w:b/>
           <w:bCs/>
         </w:rPr>
-        <w:t>91_DRAWINGS</w:t>
-      </w:r>
-    </w:p>
-    <w:p>
-      <w:pPr>
-        <w:rPr>
-          <w:rFonts w:ascii="Calibri" w:hAnsi="Calibri" w:cs="Calibri"/>
-        </w:rPr>
-      </w:pPr>
-      <w:r>
-        <w:rPr>
-          <w:rFonts w:ascii="Calibri" w:hAnsi="Calibri" w:cs="Calibri"/>
-        </w:rPr>
-        <w:t>Contains SolidWorks drawing files.</w:t>
-      </w:r>
-    </w:p>
-    <w:p>
-      <w:pPr>
-        <w:spacing w:after="120"/>
+        <w:t>FUSELAGE</w:t>
+      </w:r>
+    </w:p>
+    <w:p>
+      <w:pPr>
+        <w:spacing w:after="0"/>
         <w:rPr>
           <w:rFonts w:ascii="Calibri" w:hAnsi="Calibri" w:cs="Calibri"/>
           <w:b/>
           <w:bCs/>
+          <w:lang w:val="bg-BG"/>
         </w:rPr>
       </w:pPr>
       <w:r>
@@ -2278,357 +700,460 @@
           <w:rFonts w:ascii="Calibri" w:hAnsi="Calibri" w:cs="Calibri"/>
           <w:b/>
           <w:bCs/>
-        </w:rPr>
-        <w:t>92_EXPORTS</w:t>
-      </w:r>
-    </w:p>
-    <w:p>
-      <w:pPr>
-        <w:spacing w:after="0"/>
-        <w:rPr>
-          <w:rFonts w:ascii="Calibri" w:hAnsi="Calibri" w:cs="Calibri"/>
-        </w:rPr>
-      </w:pPr>
-      <w:r>
-        <w:rPr>
-          <w:rFonts w:ascii="Calibri" w:hAnsi="Calibri" w:cs="Calibri"/>
-        </w:rPr>
-        <w:t>Contains generated files such as:</w:t>
-      </w:r>
-    </w:p>
-    <w:p>
-      <w:pPr>
-        <w:pStyle w:val="ListParagraph"/>
-        <w:numPr>
-          <w:ilvl w:val="0"/>
-          <w:numId w:val="5"/>
-        </w:numPr>
-        <w:rPr>
-          <w:rFonts w:ascii="Calibri" w:hAnsi="Calibri" w:cs="Calibri"/>
-        </w:rPr>
-      </w:pPr>
-      <w:r>
-        <w:rPr>
-          <w:rFonts w:ascii="Calibri" w:hAnsi="Calibri" w:cs="Calibri"/>
-        </w:rPr>
-        <w:t>STEP</w:t>
-      </w:r>
-    </w:p>
-    <w:p>
-      <w:pPr>
-        <w:pStyle w:val="ListParagraph"/>
-        <w:numPr>
-          <w:ilvl w:val="0"/>
-          <w:numId w:val="5"/>
-        </w:numPr>
-        <w:rPr>
-          <w:rFonts w:ascii="Calibri" w:hAnsi="Calibri" w:cs="Calibri"/>
-        </w:rPr>
-      </w:pPr>
-      <w:r>
-        <w:rPr>
-          <w:rFonts w:ascii="Calibri" w:hAnsi="Calibri" w:cs="Calibri"/>
-        </w:rPr>
-        <w:t>STL</w:t>
-      </w:r>
-    </w:p>
-    <w:p>
-      <w:pPr>
-        <w:pStyle w:val="ListParagraph"/>
-        <w:numPr>
-          <w:ilvl w:val="0"/>
-          <w:numId w:val="5"/>
-        </w:numPr>
-        <w:rPr>
-          <w:rFonts w:ascii="Calibri" w:hAnsi="Calibri" w:cs="Calibri"/>
-        </w:rPr>
-      </w:pPr>
-      <w:r>
-        <w:rPr>
-          <w:rFonts w:ascii="Calibri" w:hAnsi="Calibri" w:cs="Calibri"/>
-        </w:rPr>
-        <w:t>DXF</w:t>
-      </w:r>
-    </w:p>
-    <w:p>
-      <w:pPr>
-        <w:pStyle w:val="ListParagraph"/>
-        <w:numPr>
-          <w:ilvl w:val="0"/>
-          <w:numId w:val="5"/>
-        </w:numPr>
-        <w:rPr>
-          <w:rFonts w:ascii="Calibri" w:hAnsi="Calibri" w:cs="Calibri"/>
-        </w:rPr>
-      </w:pPr>
-      <w:r>
-        <w:rPr>
-          <w:rFonts w:ascii="Calibri" w:hAnsi="Calibri" w:cs="Calibri"/>
-        </w:rPr>
-        <w:t>PDF</w:t>
-      </w:r>
-    </w:p>
-    <w:p>
-      <w:pPr>
-        <w:pStyle w:val="ListParagraph"/>
-        <w:numPr>
-          <w:ilvl w:val="0"/>
-          <w:numId w:val="5"/>
-        </w:numPr>
-        <w:rPr>
-          <w:rFonts w:ascii="Calibri" w:hAnsi="Calibri" w:cs="Calibri"/>
-        </w:rPr>
-      </w:pPr>
-      <w:r>
-        <w:rPr>
-          <w:rFonts w:ascii="Calibri" w:hAnsi="Calibri" w:cs="Calibri"/>
-        </w:rPr>
-        <w:t>Images</w:t>
-      </w:r>
-    </w:p>
-    <w:p>
-      <w:pPr>
-        <w:pStyle w:val="ListParagraph"/>
-        <w:numPr>
-          <w:ilvl w:val="0"/>
-          <w:numId w:val="5"/>
-        </w:numPr>
-        <w:rPr>
-          <w:rFonts w:ascii="Calibri" w:hAnsi="Calibri" w:cs="Calibri"/>
-        </w:rPr>
-      </w:pPr>
-      <w:r>
-        <w:rPr>
-          <w:rFonts w:ascii="Calibri" w:hAnsi="Calibri" w:cs="Calibri"/>
-        </w:rPr>
-        <w:t>Supplier packages</w:t>
-      </w:r>
-    </w:p>
-    <w:p>
-      <w:pPr>
-        <w:rPr>
-          <w:rFonts w:ascii="Calibri" w:hAnsi="Calibri" w:cs="Calibri"/>
-        </w:rPr>
-      </w:pPr>
-      <w:r>
-        <w:rPr>
-          <w:rFonts w:ascii="Calibri" w:hAnsi="Calibri" w:cs="Calibri"/>
-        </w:rPr>
-        <w:t>Exports are not authoritative design files. All design changes must be made in the original SolidWorks file.</w:t>
-      </w:r>
-    </w:p>
-    <w:p>
-      <w:pPr>
-        <w:spacing w:after="120"/>
+          <w:lang w:val="bg-BG"/>
+        </w:rPr>
+        <w:t>30_</w:t>
+      </w:r>
+      <w:r>
         <w:rPr>
           <w:rFonts w:ascii="Calibri" w:hAnsi="Calibri" w:cs="Calibri"/>
           <w:b/>
           <w:bCs/>
         </w:rPr>
-      </w:pPr>
-      <w:r>
+        <w:t>WING</w:t>
+      </w:r>
+    </w:p>
+    <w:p>
+      <w:pPr>
+        <w:spacing w:after="0"/>
         <w:rPr>
           <w:rFonts w:ascii="Calibri" w:hAnsi="Calibri" w:cs="Calibri"/>
           <w:b/>
           <w:bCs/>
-        </w:rPr>
-        <w:t>93_DOCUMENTATION</w:t>
-      </w:r>
-    </w:p>
-    <w:p>
-      <w:pPr>
-        <w:spacing w:after="0"/>
-        <w:rPr>
-          <w:rFonts w:ascii="Calibri" w:hAnsi="Calibri" w:cs="Calibri"/>
-        </w:rPr>
-      </w:pPr>
-      <w:r>
-        <w:rPr>
-          <w:rFonts w:ascii="Calibri" w:hAnsi="Calibri" w:cs="Calibri"/>
-        </w:rPr>
-        <w:t>Contains supporting documents such as:</w:t>
-      </w:r>
-    </w:p>
-    <w:p>
-      <w:pPr>
-        <w:pStyle w:val="ListParagraph"/>
-        <w:numPr>
-          <w:ilvl w:val="0"/>
-          <w:numId w:val="7"/>
-        </w:numPr>
-        <w:rPr>
-          <w:rFonts w:ascii="Calibri" w:hAnsi="Calibri" w:cs="Calibri"/>
-        </w:rPr>
-      </w:pPr>
-      <w:r>
-        <w:rPr>
-          <w:rFonts w:ascii="Calibri" w:hAnsi="Calibri" w:cs="Calibri"/>
-        </w:rPr>
-        <w:t>file register;</w:t>
-      </w:r>
-    </w:p>
-    <w:p>
-      <w:pPr>
-        <w:pStyle w:val="ListParagraph"/>
-        <w:numPr>
-          <w:ilvl w:val="0"/>
-          <w:numId w:val="7"/>
-        </w:numPr>
-        <w:rPr>
-          <w:rFonts w:ascii="Calibri" w:hAnsi="Calibri" w:cs="Calibri"/>
-        </w:rPr>
-      </w:pPr>
-      <w:r>
-        <w:rPr>
-          <w:rFonts w:ascii="Calibri" w:hAnsi="Calibri" w:cs="Calibri"/>
-        </w:rPr>
-        <w:t>change log;</w:t>
-      </w:r>
-    </w:p>
-    <w:p>
-      <w:pPr>
-        <w:pStyle w:val="ListParagraph"/>
-        <w:numPr>
-          <w:ilvl w:val="0"/>
-          <w:numId w:val="7"/>
-        </w:numPr>
-        <w:rPr>
-          <w:rFonts w:ascii="Calibri" w:hAnsi="Calibri" w:cs="Calibri"/>
-        </w:rPr>
-      </w:pPr>
-      <w:r>
-        <w:rPr>
-          <w:rFonts w:ascii="Calibri" w:hAnsi="Calibri" w:cs="Calibri"/>
-        </w:rPr>
-        <w:t>bill of materials;</w:t>
-      </w:r>
-    </w:p>
-    <w:p>
-      <w:pPr>
-        <w:pStyle w:val="ListParagraph"/>
-        <w:numPr>
-          <w:ilvl w:val="0"/>
-          <w:numId w:val="7"/>
-        </w:numPr>
-        <w:rPr>
-          <w:rFonts w:ascii="Calibri" w:hAnsi="Calibri" w:cs="Calibri"/>
-        </w:rPr>
-      </w:pPr>
-      <w:r>
-        <w:rPr>
-          <w:rFonts w:ascii="Calibri" w:hAnsi="Calibri" w:cs="Calibri"/>
-        </w:rPr>
-        <w:t>mass and centre-of-gravity tracking;</w:t>
-      </w:r>
-    </w:p>
-    <w:p>
-      <w:pPr>
-        <w:pStyle w:val="ListParagraph"/>
-        <w:numPr>
-          <w:ilvl w:val="0"/>
-          <w:numId w:val="7"/>
-        </w:numPr>
-        <w:rPr>
-          <w:rFonts w:ascii="Calibri" w:hAnsi="Calibri" w:cs="Calibri"/>
-        </w:rPr>
-      </w:pPr>
-      <w:r>
-        <w:rPr>
-          <w:rFonts w:ascii="Calibri" w:hAnsi="Calibri" w:cs="Calibri"/>
-        </w:rPr>
-        <w:t>interface documents;</w:t>
-      </w:r>
-    </w:p>
-    <w:p>
-      <w:pPr>
-        <w:pStyle w:val="ListParagraph"/>
-        <w:numPr>
-          <w:ilvl w:val="0"/>
-          <w:numId w:val="7"/>
-        </w:numPr>
-        <w:rPr>
-          <w:rFonts w:ascii="Calibri" w:hAnsi="Calibri" w:cs="Calibri"/>
-        </w:rPr>
-      </w:pPr>
-      <w:r>
-        <w:rPr>
-          <w:rFonts w:ascii="Calibri" w:hAnsi="Calibri" w:cs="Calibri"/>
-        </w:rPr>
-        <w:t>assembly instructions.</w:t>
-      </w:r>
-    </w:p>
-    <w:p>
-      <w:pPr>
-        <w:pStyle w:val="ListParagraph"/>
-        <w:numPr>
-          <w:ilvl w:val="0"/>
-          <w:numId w:val="7"/>
-        </w:numPr>
-        <w:rPr>
-          <w:rFonts w:ascii="Calibri" w:hAnsi="Calibri" w:cs="Calibri"/>
-        </w:rPr>
-      </w:pPr>
-      <w:r>
-        <w:rPr>
-          <w:rFonts w:ascii="Calibri" w:hAnsi="Calibri" w:cs="Calibri"/>
-        </w:rPr>
-        <w:t>Etc.</w:t>
-      </w:r>
-    </w:p>
-    <w:p>
-      <w:pPr>
-        <w:spacing w:after="120"/>
+          <w:lang w:val="bg-BG"/>
+        </w:rPr>
+      </w:pPr>
+      <w:r>
         <w:rPr>
           <w:rFonts w:ascii="Calibri" w:hAnsi="Calibri" w:cs="Calibri"/>
           <w:b/>
           <w:bCs/>
-        </w:rPr>
-      </w:pPr>
+          <w:lang w:val="bg-BG"/>
+        </w:rPr>
+        <w:t>40_</w:t>
+      </w:r>
       <w:r>
         <w:rPr>
           <w:rFonts w:ascii="Calibri" w:hAnsi="Calibri" w:cs="Calibri"/>
           <w:b/>
           <w:bCs/>
         </w:rPr>
-        <w:t>99_ARCHIVE</w:t>
-      </w:r>
-    </w:p>
-    <w:p>
-      <w:pPr>
-        <w:spacing w:after="0"/>
-        <w:rPr>
-          <w:rFonts w:ascii="Calibri" w:hAnsi="Calibri" w:cs="Calibri"/>
-        </w:rPr>
-      </w:pPr>
-      <w:r>
-        <w:rPr>
-          <w:rFonts w:ascii="Calibri" w:hAnsi="Calibri" w:cs="Calibri"/>
-        </w:rPr>
-        <w:t>Contains superseded, abandoned, or historical files.</w:t>
-      </w:r>
-    </w:p>
-    <w:p>
-      <w:pPr>
-        <w:spacing w:after="120"/>
-        <w:rPr>
-          <w:rFonts w:ascii="Calibri" w:hAnsi="Calibri" w:cs="Calibri"/>
-          <w:u w:val="single"/>
-        </w:rPr>
-      </w:pPr>
-      <w:r>
-        <w:rPr>
-          <w:rFonts w:ascii="Calibri" w:hAnsi="Calibri" w:cs="Calibri"/>
-          <w:u w:val="single"/>
-        </w:rPr>
-        <w:t>Active assemblies shall never reference files stored in 99_ARCHIVE.</w:t>
-      </w:r>
-    </w:p>
-    <w:p>
-      <w:pPr>
-        <w:rPr>
-          <w:rFonts w:ascii="Calibri" w:hAnsi="Calibri" w:cs="Calibri"/>
-        </w:rPr>
-      </w:pPr>
+        <w:t>TAIL</w:t>
+      </w:r>
+    </w:p>
+    <w:p>
+      <w:pPr>
+        <w:spacing w:after="0"/>
+        <w:rPr>
+          <w:rFonts w:ascii="Calibri" w:hAnsi="Calibri" w:cs="Calibri"/>
+          <w:b/>
+          <w:bCs/>
+          <w:lang w:val="bg-BG"/>
+        </w:rPr>
+      </w:pPr>
+      <w:r>
+        <w:rPr>
+          <w:rFonts w:ascii="Calibri" w:hAnsi="Calibri" w:cs="Calibri"/>
+          <w:b/>
+          <w:bCs/>
+          <w:lang w:val="bg-BG"/>
+        </w:rPr>
+        <w:t>50_</w:t>
+      </w:r>
+      <w:r>
+        <w:rPr>
+          <w:rFonts w:ascii="Calibri" w:hAnsi="Calibri" w:cs="Calibri"/>
+          <w:b/>
+          <w:bCs/>
+        </w:rPr>
+        <w:t>PROPULSION</w:t>
+      </w:r>
+      <w:r>
+        <w:rPr>
+          <w:rFonts w:ascii="Calibri" w:hAnsi="Calibri" w:cs="Calibri"/>
+          <w:b/>
+          <w:bCs/>
+          <w:lang w:val="bg-BG"/>
+        </w:rPr>
+        <w:t>_</w:t>
+      </w:r>
+      <w:r>
+        <w:rPr>
+          <w:rFonts w:ascii="Calibri" w:hAnsi="Calibri" w:cs="Calibri"/>
+          <w:b/>
+          <w:bCs/>
+        </w:rPr>
+        <w:t>AND</w:t>
+      </w:r>
+      <w:r>
+        <w:rPr>
+          <w:rFonts w:ascii="Calibri" w:hAnsi="Calibri" w:cs="Calibri"/>
+          <w:b/>
+          <w:bCs/>
+          <w:lang w:val="bg-BG"/>
+        </w:rPr>
+        <w:t>_</w:t>
+      </w:r>
+      <w:r>
+        <w:rPr>
+          <w:rFonts w:ascii="Calibri" w:hAnsi="Calibri" w:cs="Calibri"/>
+          <w:b/>
+          <w:bCs/>
+        </w:rPr>
+        <w:t>TILT</w:t>
+      </w:r>
+    </w:p>
+    <w:p>
+      <w:pPr>
+        <w:spacing w:after="0"/>
+        <w:rPr>
+          <w:rFonts w:ascii="Calibri" w:hAnsi="Calibri" w:cs="Calibri"/>
+          <w:b/>
+          <w:bCs/>
+          <w:lang w:val="bg-BG"/>
+        </w:rPr>
+      </w:pPr>
+      <w:r>
+        <w:rPr>
+          <w:rFonts w:ascii="Calibri" w:hAnsi="Calibri" w:cs="Calibri"/>
+          <w:b/>
+          <w:bCs/>
+          <w:lang w:val="bg-BG"/>
+        </w:rPr>
+        <w:t>60_</w:t>
+      </w:r>
+      <w:r>
+        <w:rPr>
+          <w:rFonts w:ascii="Calibri" w:hAnsi="Calibri" w:cs="Calibri"/>
+          <w:b/>
+          <w:bCs/>
+        </w:rPr>
+        <w:t>LANDING</w:t>
+      </w:r>
+      <w:r>
+        <w:rPr>
+          <w:rFonts w:ascii="Calibri" w:hAnsi="Calibri" w:cs="Calibri"/>
+          <w:b/>
+          <w:bCs/>
+          <w:lang w:val="bg-BG"/>
+        </w:rPr>
+        <w:t>_</w:t>
+      </w:r>
+      <w:r>
+        <w:rPr>
+          <w:rFonts w:ascii="Calibri" w:hAnsi="Calibri" w:cs="Calibri"/>
+          <w:b/>
+          <w:bCs/>
+        </w:rPr>
+        <w:t>GEAR</w:t>
+      </w:r>
+    </w:p>
+    <w:p>
+      <w:pPr>
+        <w:spacing w:after="0"/>
+        <w:rPr>
+          <w:rFonts w:ascii="Calibri" w:hAnsi="Calibri" w:cs="Calibri"/>
+          <w:b/>
+          <w:bCs/>
+          <w:lang w:val="bg-BG"/>
+        </w:rPr>
+      </w:pPr>
+      <w:r>
+        <w:rPr>
+          <w:rFonts w:ascii="Calibri" w:hAnsi="Calibri" w:cs="Calibri"/>
+          <w:b/>
+          <w:bCs/>
+          <w:lang w:val="bg-BG"/>
+        </w:rPr>
+        <w:t>70_</w:t>
+      </w:r>
+      <w:r>
+        <w:rPr>
+          <w:rFonts w:ascii="Calibri" w:hAnsi="Calibri" w:cs="Calibri"/>
+          <w:b/>
+          <w:bCs/>
+        </w:rPr>
+        <w:t>AVIONICS</w:t>
+      </w:r>
+      <w:r>
+        <w:rPr>
+          <w:rFonts w:ascii="Calibri" w:hAnsi="Calibri" w:cs="Calibri"/>
+          <w:b/>
+          <w:bCs/>
+          <w:lang w:val="bg-BG"/>
+        </w:rPr>
+        <w:t>_</w:t>
+      </w:r>
+      <w:r>
+        <w:rPr>
+          <w:rFonts w:ascii="Calibri" w:hAnsi="Calibri" w:cs="Calibri"/>
+          <w:b/>
+          <w:bCs/>
+        </w:rPr>
+        <w:t>AND</w:t>
+      </w:r>
+      <w:r>
+        <w:rPr>
+          <w:rFonts w:ascii="Calibri" w:hAnsi="Calibri" w:cs="Calibri"/>
+          <w:b/>
+          <w:bCs/>
+          <w:lang w:val="bg-BG"/>
+        </w:rPr>
+        <w:t>_</w:t>
+      </w:r>
+      <w:r>
+        <w:rPr>
+          <w:rFonts w:ascii="Calibri" w:hAnsi="Calibri" w:cs="Calibri"/>
+          <w:b/>
+          <w:bCs/>
+        </w:rPr>
+        <w:t>ELECTRICAL</w:t>
+      </w:r>
+    </w:p>
+    <w:p>
+      <w:pPr>
+        <w:spacing w:after="0"/>
+        <w:rPr>
+          <w:rFonts w:ascii="Calibri" w:hAnsi="Calibri" w:cs="Calibri"/>
+          <w:b/>
+          <w:bCs/>
+          <w:lang w:val="bg-BG"/>
+        </w:rPr>
+      </w:pPr>
+      <w:r>
+        <w:rPr>
+          <w:rFonts w:ascii="Calibri" w:hAnsi="Calibri" w:cs="Calibri"/>
+          <w:b/>
+          <w:bCs/>
+          <w:lang w:val="bg-BG"/>
+        </w:rPr>
+        <w:t>80_</w:t>
+      </w:r>
+      <w:r>
+        <w:rPr>
+          <w:rFonts w:ascii="Calibri" w:hAnsi="Calibri" w:cs="Calibri"/>
+          <w:b/>
+          <w:bCs/>
+        </w:rPr>
+        <w:t>PAYLOAD</w:t>
+      </w:r>
+    </w:p>
+    <w:p>
+      <w:pPr>
+        <w:spacing w:after="0"/>
+        <w:rPr>
+          <w:rFonts w:ascii="Calibri" w:hAnsi="Calibri" w:cs="Calibri"/>
+          <w:b/>
+          <w:bCs/>
+          <w:lang w:val="bg-BG"/>
+        </w:rPr>
+      </w:pPr>
+      <w:r>
+        <w:rPr>
+          <w:rFonts w:ascii="Calibri" w:hAnsi="Calibri" w:cs="Calibri"/>
+          <w:b/>
+          <w:bCs/>
+          <w:lang w:val="bg-BG"/>
+        </w:rPr>
+        <w:t>99_</w:t>
+      </w:r>
+      <w:r>
+        <w:rPr>
+          <w:rFonts w:ascii="Calibri" w:hAnsi="Calibri" w:cs="Calibri"/>
+          <w:b/>
+          <w:bCs/>
+        </w:rPr>
+        <w:t>ARCHIVE</w:t>
+      </w:r>
+    </w:p>
+    <w:p>
+      <w:pPr>
+        <w:rPr>
+          <w:rFonts w:ascii="Calibri" w:hAnsi="Calibri" w:cs="Calibri"/>
+          <w:i/>
+          <w:iCs/>
+        </w:rPr>
+      </w:pPr>
+      <w:r>
+        <w:rPr>
+          <w:rFonts w:ascii="Calibri" w:hAnsi="Calibri" w:cs="Calibri"/>
+          <w:i/>
+          <w:iCs/>
+        </w:rPr>
+        <w:t>All active files shall be stored inside this structure.</w:t>
+      </w:r>
+    </w:p>
+    <w:p>
+      <w:pPr>
+        <w:spacing w:after="0"/>
+        <w:rPr>
+          <w:rFonts w:ascii="Calibri" w:hAnsi="Calibri" w:cs="Calibri"/>
+          <w:i/>
+          <w:iCs/>
+        </w:rPr>
+      </w:pPr>
+      <w:r>
+        <w:rPr>
+          <w:rFonts w:ascii="Calibri" w:hAnsi="Calibri" w:cs="Calibri"/>
+          <w:i/>
+          <w:iCs/>
+        </w:rPr>
+        <w:t>Files shall not be referenced from:</w:t>
+      </w:r>
+    </w:p>
+    <w:p>
+      <w:pPr>
+        <w:pStyle w:val="ListParagraph"/>
+        <w:numPr>
+          <w:ilvl w:val="0"/>
+          <w:numId w:val="15"/>
+        </w:numPr>
+        <w:rPr>
+          <w:rFonts w:ascii="Calibri" w:hAnsi="Calibri" w:cs="Calibri"/>
+          <w:i/>
+          <w:iCs/>
+        </w:rPr>
+      </w:pPr>
+      <w:r>
+        <w:rPr>
+          <w:rFonts w:ascii="Calibri" w:hAnsi="Calibri" w:cs="Calibri"/>
+          <w:i/>
+          <w:iCs/>
+        </w:rPr>
+        <w:t>Desktop;</w:t>
+      </w:r>
+    </w:p>
+    <w:p>
+      <w:pPr>
+        <w:pStyle w:val="ListParagraph"/>
+        <w:numPr>
+          <w:ilvl w:val="0"/>
+          <w:numId w:val="15"/>
+        </w:numPr>
+        <w:rPr>
+          <w:rFonts w:ascii="Calibri" w:hAnsi="Calibri" w:cs="Calibri"/>
+          <w:i/>
+          <w:iCs/>
+        </w:rPr>
+      </w:pPr>
+      <w:r>
+        <w:rPr>
+          <w:rFonts w:ascii="Calibri" w:hAnsi="Calibri" w:cs="Calibri"/>
+          <w:i/>
+          <w:iCs/>
+        </w:rPr>
+        <w:t>Downloads;</w:t>
+      </w:r>
+    </w:p>
+    <w:p>
+      <w:pPr>
+        <w:pStyle w:val="ListParagraph"/>
+        <w:numPr>
+          <w:ilvl w:val="0"/>
+          <w:numId w:val="15"/>
+        </w:numPr>
+        <w:rPr>
+          <w:rFonts w:ascii="Calibri" w:hAnsi="Calibri" w:cs="Calibri"/>
+          <w:i/>
+          <w:iCs/>
+        </w:rPr>
+      </w:pPr>
+      <w:r>
+        <w:rPr>
+          <w:rFonts w:ascii="Calibri" w:hAnsi="Calibri" w:cs="Calibri"/>
+          <w:i/>
+          <w:iCs/>
+        </w:rPr>
+        <w:t>email attachments;</w:t>
+      </w:r>
+    </w:p>
+    <w:p>
+      <w:pPr>
+        <w:pStyle w:val="ListParagraph"/>
+        <w:numPr>
+          <w:ilvl w:val="0"/>
+          <w:numId w:val="15"/>
+        </w:numPr>
+        <w:rPr>
+          <w:rFonts w:ascii="Calibri" w:hAnsi="Calibri" w:cs="Calibri"/>
+          <w:i/>
+          <w:iCs/>
+        </w:rPr>
+      </w:pPr>
+      <w:r>
+        <w:rPr>
+          <w:rFonts w:ascii="Calibri" w:hAnsi="Calibri" w:cs="Calibri"/>
+          <w:i/>
+          <w:iCs/>
+        </w:rPr>
+        <w:t>personal folders;</w:t>
+      </w:r>
+    </w:p>
+    <w:p>
+      <w:pPr>
+        <w:pStyle w:val="ListParagraph"/>
+        <w:numPr>
+          <w:ilvl w:val="0"/>
+          <w:numId w:val="15"/>
+        </w:numPr>
+        <w:rPr>
+          <w:rFonts w:ascii="Calibri" w:hAnsi="Calibri" w:cs="Calibri"/>
+          <w:i/>
+          <w:iCs/>
+        </w:rPr>
+      </w:pPr>
+      <w:r>
+        <w:rPr>
+          <w:rFonts w:ascii="Calibri" w:hAnsi="Calibri" w:cs="Calibri"/>
+          <w:i/>
+          <w:iCs/>
+        </w:rPr>
+        <w:t>temporary folders;</w:t>
+      </w:r>
+    </w:p>
+    <w:p>
+      <w:pPr>
+        <w:pStyle w:val="ListParagraph"/>
+        <w:numPr>
+          <w:ilvl w:val="0"/>
+          <w:numId w:val="15"/>
+        </w:numPr>
+        <w:rPr>
+          <w:rFonts w:ascii="Calibri" w:hAnsi="Calibri" w:cs="Calibri"/>
+          <w:i/>
+          <w:iCs/>
+        </w:rPr>
+      </w:pPr>
+      <w:r>
+        <w:rPr>
+          <w:rFonts w:ascii="Calibri" w:hAnsi="Calibri" w:cs="Calibri"/>
+          <w:i/>
+          <w:iCs/>
+        </w:rPr>
+        <w:t>USB drives;</w:t>
+      </w:r>
+    </w:p>
+    <w:p>
+      <w:pPr>
+        <w:pStyle w:val="ListParagraph"/>
+        <w:numPr>
+          <w:ilvl w:val="0"/>
+          <w:numId w:val="15"/>
+        </w:numPr>
+        <w:rPr>
+          <w:rFonts w:ascii="Calibri" w:hAnsi="Calibri" w:cs="Calibri"/>
+          <w:i/>
+          <w:iCs/>
+        </w:rPr>
+      </w:pPr>
+      <w:r>
+        <w:rPr>
+          <w:rFonts w:ascii="Calibri" w:hAnsi="Calibri" w:cs="Calibri"/>
+          <w:i/>
+          <w:iCs/>
+        </w:rPr>
+        <w:t>old project folders.</w:t>
+      </w:r>
     </w:p>
     <w:p>
       <w:pPr>
@@ -2663,104 +1188,17 @@
       </w:r>
     </w:p>
     <w:p>
-      <w:pPr>
-        <w:spacing w:after="0"/>
-        <w:rPr>
-          <w:rFonts w:ascii="Calibri" w:hAnsi="Calibri" w:cs="Calibri"/>
-        </w:rPr>
-      </w:pPr>
-      <w:r>
-        <w:rPr>
-          <w:rFonts w:ascii="Calibri" w:hAnsi="Calibri" w:cs="Calibri"/>
-        </w:rPr>
-        <w:t>Designed parts and assemblies shall use:</w:t>
-      </w:r>
-    </w:p>
-    <w:p>
-      <w:pPr>
-        <w:rPr>
-          <w:rFonts w:ascii="Calibri" w:hAnsi="Calibri" w:cs="Calibri"/>
-        </w:rPr>
-      </w:pPr>
-      <w:r>
-        <w:rPr>
-          <w:rFonts w:ascii="Calibri" w:hAnsi="Calibri" w:cs="Calibri"/>
-        </w:rPr>
-        <w:t>OF-P01-[SYSTEM]-[NUMBER]</w:t>
-      </w:r>
-      <w:proofErr w:type="gramStart"/>
-      <w:r>
-        <w:rPr>
-          <w:rFonts w:ascii="Calibri" w:hAnsi="Calibri" w:cs="Calibri"/>
-        </w:rPr>
-        <w:t>-[</w:t>
-      </w:r>
-      <w:proofErr w:type="gramEnd"/>
-      <w:r>
-        <w:rPr>
-          <w:rFonts w:ascii="Calibri" w:hAnsi="Calibri" w:cs="Calibri"/>
-        </w:rPr>
-        <w:t>CREATION DATE]-[DESCRIPTION</w:t>
-      </w:r>
-      <w:proofErr w:type="gramStart"/>
-      <w:r>
-        <w:rPr>
-          <w:rFonts w:ascii="Calibri" w:hAnsi="Calibri" w:cs="Calibri"/>
-        </w:rPr>
-        <w:t>].[</w:t>
-      </w:r>
-      <w:proofErr w:type="gramEnd"/>
-      <w:r>
-        <w:rPr>
-          <w:rFonts w:ascii="Calibri" w:hAnsi="Calibri" w:cs="Calibri"/>
-        </w:rPr>
-        <w:t>EXTENSION]</w:t>
-      </w:r>
-    </w:p>
-    <w:p>
-      <w:pPr>
-        <w:spacing w:after="0"/>
-        <w:rPr>
-          <w:rFonts w:ascii="Calibri" w:hAnsi="Calibri" w:cs="Calibri"/>
-        </w:rPr>
-      </w:pPr>
-      <w:r>
-        <w:rPr>
-          <w:rFonts w:ascii="Calibri" w:hAnsi="Calibri" w:cs="Calibri"/>
-        </w:rPr>
-        <w:t>Example:</w:t>
-      </w:r>
-    </w:p>
-    <w:p>
-      <w:pPr>
-        <w:rPr>
-          <w:rFonts w:ascii="Calibri" w:hAnsi="Calibri" w:cs="Calibri"/>
-        </w:rPr>
-      </w:pPr>
-      <w:r>
-        <w:rPr>
-          <w:rFonts w:ascii="Calibri" w:hAnsi="Calibri" w:cs="Calibri"/>
-        </w:rPr>
-        <w:t>OF-P01-WNG-001-20260723-WING_SKIN.SLDPRT</w:t>
-      </w:r>
-    </w:p>
-    <w:p>
-      <w:pPr>
-        <w:spacing w:after="0"/>
-        <w:rPr>
-          <w:rFonts w:ascii="Calibri" w:hAnsi="Calibri" w:cs="Calibri"/>
-        </w:rPr>
-      </w:pPr>
-      <w:r>
-        <w:rPr>
-          <w:rFonts w:ascii="Calibri" w:hAnsi="Calibri" w:cs="Calibri"/>
-        </w:rPr>
-        <w:t>The fields mean:</w:t>
+      <w:r>
+        <w:rPr>
+          <w:b/>
+          <w:bCs/>
+        </w:rPr>
+        <w:t>AAA-BB-CC-XXX_yymmdd_Name</w:t>
       </w:r>
     </w:p>
     <w:tbl>
       <w:tblPr>
-        <w:tblW w:w="0" w:type="auto"/>
+        <w:tblW w:w="9634" w:type="dxa"/>
         <w:tblCellSpacing w:w="15" w:type="dxa"/>
         <w:tblBorders>
           <w:top w:val="single" w:sz="4" w:space="0" w:color="auto"/>
@@ -2780,7 +1218,7 @@
       </w:tblPr>
       <w:tblGrid>
         <w:gridCol w:w="1246"/>
-        <w:gridCol w:w="5363"/>
+        <w:gridCol w:w="8388"/>
       </w:tblGrid>
       <w:tr>
         <w:trPr>
@@ -2812,7 +1250,7 @@
         </w:tc>
         <w:tc>
           <w:tcPr>
-            <w:tcW w:w="0" w:type="auto"/>
+            <w:tcW w:w="8343" w:type="dxa"/>
             <w:vAlign w:val="center"/>
             <w:hideMark/>
           </w:tcPr>
@@ -2853,15 +1291,15 @@
             </w:pPr>
             <w:r>
               <w:rPr>
-                <w:rFonts w:ascii="Calibri" w:hAnsi="Calibri" w:cs="Calibri"/>
-              </w:rPr>
-              <w:t>OF</w:t>
+                <w:lang w:val="fr-FR"/>
+              </w:rPr>
+              <w:t>AAA</w:t>
             </w:r>
           </w:p>
         </w:tc>
         <w:tc>
           <w:tcPr>
-            <w:tcW w:w="0" w:type="auto"/>
+            <w:tcW w:w="8343" w:type="dxa"/>
             <w:vAlign w:val="center"/>
             <w:hideMark/>
           </w:tcPr>
@@ -2869,60 +1307,22 @@
             <w:pPr>
               <w:rPr>
                 <w:rFonts w:ascii="Calibri" w:hAnsi="Calibri" w:cs="Calibri"/>
-              </w:rPr>
-            </w:pPr>
-            <w:proofErr w:type="spellStart"/>
-            <w:r>
-              <w:rPr>
-                <w:rFonts w:ascii="Calibri" w:hAnsi="Calibri" w:cs="Calibri"/>
-              </w:rPr>
-              <w:t>OrgoFly</w:t>
-            </w:r>
-            <w:proofErr w:type="spellEnd"/>
-          </w:p>
-        </w:tc>
-      </w:tr>
-      <w:tr>
-        <w:trPr>
-          <w:tblCellSpacing w:w="15" w:type="dxa"/>
-        </w:trPr>
-        <w:tc>
-          <w:tcPr>
-            <w:tcW w:w="0" w:type="auto"/>
-            <w:vAlign w:val="center"/>
-            <w:hideMark/>
-          </w:tcPr>
-          <w:p>
-            <w:pPr>
-              <w:rPr>
-                <w:rFonts w:ascii="Calibri" w:hAnsi="Calibri" w:cs="Calibri"/>
+                <w:lang w:val="fr-FR"/>
               </w:rPr>
             </w:pPr>
             <w:r>
               <w:rPr>
-                <w:rFonts w:ascii="Calibri" w:hAnsi="Calibri" w:cs="Calibri"/>
-              </w:rPr>
-              <w:t>P01</w:t>
+                <w:lang w:val="fr-FR"/>
+              </w:rPr>
+              <w:t xml:space="preserve">3 letter/number project code </w:t>
             </w:r>
-          </w:p>
-        </w:tc>
-        <w:tc>
-          <w:tcPr>
-            <w:tcW w:w="0" w:type="auto"/>
-            <w:vAlign w:val="center"/>
-            <w:hideMark/>
-          </w:tcPr>
-          <w:p>
-            <w:pPr>
-              <w:rPr>
-                <w:rFonts w:ascii="Calibri" w:hAnsi="Calibri" w:cs="Calibri"/>
-              </w:rPr>
-            </w:pPr>
             <w:r>
               <w:rPr>
-                <w:rFonts w:ascii="Calibri" w:hAnsi="Calibri" w:cs="Calibri"/>
-              </w:rPr>
-              <w:t>Prototype 01</w:t>
+                <w:i/>
+                <w:iCs/>
+                <w:lang w:val="fr-FR"/>
+              </w:rPr>
+              <w:t>(ex. P01,F02,C01, etc)</w:t>
             </w:r>
           </w:p>
         </w:tc>
@@ -2944,30 +1344,26 @@
               </w:rPr>
             </w:pPr>
             <w:r>
-              <w:rPr>
-                <w:rFonts w:ascii="Calibri" w:hAnsi="Calibri" w:cs="Calibri"/>
-              </w:rPr>
-              <w:t>WNG</w:t>
+              <w:t>BB</w:t>
             </w:r>
           </w:p>
         </w:tc>
         <w:tc>
           <w:tcPr>
-            <w:tcW w:w="0" w:type="auto"/>
+            <w:tcW w:w="8343" w:type="dxa"/>
             <w:vAlign w:val="center"/>
             <w:hideMark/>
           </w:tcPr>
           <w:p>
-            <w:pPr>
-              <w:rPr>
-                <w:rFonts w:ascii="Calibri" w:hAnsi="Calibri" w:cs="Calibri"/>
-              </w:rPr>
-            </w:pPr>
             <w:r>
-              <w:rPr>
-                <w:rFonts w:ascii="Calibri" w:hAnsi="Calibri" w:cs="Calibri"/>
-              </w:rPr>
-              <w:t>Wing subsystem</w:t>
+              <w:t xml:space="preserve">2 number assembly code </w:t>
+            </w:r>
+            <w:r>
+              <w:rPr>
+                <w:i/>
+                <w:iCs/>
+              </w:rPr>
+              <w:t>(refer to section 2)</w:t>
             </w:r>
           </w:p>
         </w:tc>
@@ -2990,35 +1386,28 @@
             </w:pPr>
             <w:r>
               <w:rPr>
-                <w:rFonts w:ascii="Calibri" w:hAnsi="Calibri" w:cs="Calibri"/>
-              </w:rPr>
-              <w:t>001</w:t>
+                <w:lang w:val="fr-FR"/>
+              </w:rPr>
+              <w:t>CC</w:t>
             </w:r>
           </w:p>
         </w:tc>
         <w:tc>
           <w:tcPr>
-            <w:tcW w:w="0" w:type="auto"/>
+            <w:tcW w:w="8343" w:type="dxa"/>
             <w:vAlign w:val="center"/>
             <w:hideMark/>
           </w:tcPr>
           <w:p>
-            <w:pPr>
-              <w:rPr>
-                <w:rFonts w:ascii="Calibri" w:hAnsi="Calibri" w:cs="Calibri"/>
-              </w:rPr>
-            </w:pPr>
             <w:r>
-              <w:rPr>
-                <w:rFonts w:ascii="Calibri" w:hAnsi="Calibri" w:cs="Calibri"/>
-              </w:rPr>
-              <w:t>Permanent component number</w:t>
+              <w:t xml:space="preserve">2 number subassembly code </w:t>
             </w:r>
             <w:r>
               <w:rPr>
-                <w:rFonts w:ascii="Calibri" w:hAnsi="Calibri" w:cs="Calibri"/>
-              </w:rPr>
-              <w:t xml:space="preserve"> (unique for each part)</w:t>
+                <w:i/>
+                <w:iCs/>
+              </w:rPr>
+              <w:t>(ex. RH Wing, LH Wing)</w:t>
             </w:r>
           </w:p>
         </w:tc>
@@ -3040,16 +1429,13 @@
               </w:rPr>
             </w:pPr>
             <w:r>
-              <w:rPr>
-                <w:rFonts w:ascii="Calibri" w:hAnsi="Calibri" w:cs="Calibri"/>
-              </w:rPr>
-              <w:t>20260723</w:t>
+              <w:t>XXX</w:t>
             </w:r>
           </w:p>
         </w:tc>
         <w:tc>
           <w:tcPr>
-            <w:tcW w:w="0" w:type="auto"/>
+            <w:tcW w:w="8343" w:type="dxa"/>
             <w:vAlign w:val="center"/>
             <w:hideMark/>
           </w:tcPr>
@@ -3060,10 +1446,14 @@
               </w:rPr>
             </w:pPr>
             <w:r>
-              <w:rPr>
-                <w:rFonts w:ascii="Calibri" w:hAnsi="Calibri" w:cs="Calibri"/>
-              </w:rPr>
-              <w:t>Date this specific file was created</w:t>
+              <w:t xml:space="preserve">3 number component code </w:t>
+            </w:r>
+            <w:r>
+              <w:rPr>
+                <w:i/>
+                <w:iCs/>
+              </w:rPr>
+              <w:t>(consecutive and unique for each component)</w:t>
             </w:r>
           </w:p>
         </w:tc>
@@ -3088,10 +1478,34 @@
               <w:rPr>
                 <w:rFonts w:ascii="Calibri" w:hAnsi="Calibri" w:cs="Calibri"/>
               </w:rPr>
-              <w:t>WING_SKIN</w:t>
+              <w:t>yymmdd</w:t>
             </w:r>
           </w:p>
         </w:tc>
+        <w:tc>
+          <w:tcPr>
+            <w:tcW w:w="8343" w:type="dxa"/>
+            <w:vAlign w:val="center"/>
+            <w:hideMark/>
+          </w:tcPr>
+          <w:p>
+            <w:r>
+              <w:t xml:space="preserve">date the document was CREATED </w:t>
+            </w:r>
+            <w:r>
+              <w:rPr>
+                <w:i/>
+                <w:iCs/>
+              </w:rPr>
+              <w:t>(refer to section 5)</w:t>
+            </w:r>
+          </w:p>
+        </w:tc>
+      </w:tr>
+      <w:tr>
+        <w:trPr>
+          <w:tblCellSpacing w:w="15" w:type="dxa"/>
+        </w:trPr>
         <w:tc>
           <w:tcPr>
             <w:tcW w:w="0" w:type="auto"/>
@@ -3108,12 +1522,610 @@
               <w:rPr>
                 <w:rFonts w:ascii="Calibri" w:hAnsi="Calibri" w:cs="Calibri"/>
               </w:rPr>
-              <w:t>Component description</w:t>
+              <w:t>Name</w:t>
+            </w:r>
+          </w:p>
+        </w:tc>
+        <w:tc>
+          <w:tcPr>
+            <w:tcW w:w="8343" w:type="dxa"/>
+            <w:vAlign w:val="center"/>
+            <w:hideMark/>
+          </w:tcPr>
+          <w:p>
+            <w:pPr>
+              <w:rPr>
+                <w:rFonts w:ascii="Calibri" w:hAnsi="Calibri" w:cs="Calibri"/>
+              </w:rPr>
+            </w:pPr>
+            <w:r>
+              <w:t>Ends with component name</w:t>
             </w:r>
           </w:p>
         </w:tc>
       </w:tr>
     </w:tbl>
+    <w:p/>
+    <w:p>
+      <w:r>
+        <w:t>"0" designator reserved for main assembly and skipped</w:t>
+      </w:r>
+    </w:p>
+    <w:p>
+      <w:pPr>
+        <w:rPr>
+          <w:i/>
+          <w:iCs/>
+        </w:rPr>
+      </w:pPr>
+    </w:p>
+    <w:p>
+      <w:pPr>
+        <w:rPr>
+          <w:i/>
+          <w:iCs/>
+        </w:rPr>
+      </w:pPr>
+      <w:r>
+        <w:rPr>
+          <w:i/>
+          <w:iCs/>
+        </w:rPr>
+        <w:t xml:space="preserve">Example: </w:t>
+      </w:r>
+      <w:r>
+        <w:rPr>
+          <w:i/>
+          <w:iCs/>
+        </w:rPr>
+        <w:t>P01-30-02-01_260724_Wing_Root_RH</w:t>
+      </w:r>
+    </w:p>
+    <w:p/>
+    <w:p>
+      <w:pPr>
+        <w:rPr>
+          <w:b/>
+          <w:bCs/>
+        </w:rPr>
+      </w:pPr>
+      <w:r>
+        <w:rPr>
+          <w:b/>
+          <w:bCs/>
+        </w:rPr>
+        <w:t>Sourced and standard components retain their original names:</w:t>
+      </w:r>
+    </w:p>
+    <w:p>
+      <w:r>
+        <w:t xml:space="preserve">Ex: Avenger_3210-500KV </w:t>
+      </w:r>
+    </w:p>
+    <w:p>
+      <w:r>
+        <w:t>Ex: Threaded Insert M4 x 4mm</w:t>
+      </w:r>
+    </w:p>
+    <w:p>
+      <w:pPr>
+        <w:rPr>
+          <w:rFonts w:ascii="Calibri" w:hAnsi="Calibri" w:cs="Calibri"/>
+        </w:rPr>
+      </w:pPr>
+      <w:r>
+        <w:rPr>
+          <w:rFonts w:ascii="Calibri" w:hAnsi="Calibri" w:cs="Calibri"/>
+        </w:rPr>
+        <w:br w:type="page"/>
+      </w:r>
+    </w:p>
+    <w:p>
+      <w:pPr>
+        <w:pStyle w:val="Heading2"/>
+        <w:numPr>
+          <w:ilvl w:val="0"/>
+          <w:numId w:val="13"/>
+        </w:numPr>
+        <w:rPr>
+          <w:rFonts w:ascii="Calibri" w:hAnsi="Calibri" w:cs="Calibri"/>
+        </w:rPr>
+      </w:pPr>
+      <w:r>
+        <w:rPr>
+          <w:rFonts w:ascii="Calibri" w:hAnsi="Calibri" w:cs="Calibri"/>
+        </w:rPr>
+        <w:lastRenderedPageBreak/>
+        <w:t>Folder usage</w:t>
+      </w:r>
+    </w:p>
+    <w:p>
+      <w:pPr>
+        <w:rPr>
+          <w:rFonts w:ascii="Calibri" w:hAnsi="Calibri" w:cs="Calibri"/>
+          <w:b/>
+          <w:bCs/>
+        </w:rPr>
+      </w:pPr>
+      <w:r>
+        <w:rPr>
+          <w:rFonts w:ascii="Calibri" w:hAnsi="Calibri" w:cs="Calibri"/>
+          <w:b/>
+          <w:bCs/>
+        </w:rPr>
+        <w:t>00_TOP_LEVEL</w:t>
+      </w:r>
+    </w:p>
+    <w:p>
+      <w:pPr>
+        <w:rPr>
+          <w:rFonts w:ascii="Calibri" w:hAnsi="Calibri" w:cs="Calibri"/>
+        </w:rPr>
+      </w:pPr>
+      <w:r>
+        <w:rPr>
+          <w:rFonts w:ascii="Calibri" w:hAnsi="Calibri" w:cs="Calibri"/>
+        </w:rPr>
+        <w:t>Contains the complete aircraft assembly and other full-aircraft configurations.</w:t>
+      </w:r>
+    </w:p>
+    <w:p>
+      <w:pPr>
+        <w:spacing w:after="0"/>
+        <w:rPr>
+          <w:rFonts w:ascii="Calibri" w:hAnsi="Calibri" w:cs="Calibri"/>
+          <w:i/>
+          <w:iCs/>
+        </w:rPr>
+      </w:pPr>
+      <w:r>
+        <w:rPr>
+          <w:rFonts w:ascii="Calibri" w:hAnsi="Calibri" w:cs="Calibri"/>
+          <w:i/>
+          <w:iCs/>
+        </w:rPr>
+        <w:t>Example:</w:t>
+      </w:r>
+    </w:p>
+    <w:p>
+      <w:pPr>
+        <w:rPr>
+          <w:rFonts w:ascii="Calibri" w:hAnsi="Calibri" w:cs="Calibri"/>
+          <w:i/>
+          <w:iCs/>
+        </w:rPr>
+      </w:pPr>
+      <w:r>
+        <w:rPr>
+          <w:rFonts w:ascii="Calibri" w:hAnsi="Calibri" w:cs="Calibri"/>
+          <w:i/>
+          <w:iCs/>
+        </w:rPr>
+        <w:t>OF-P01-TOP-000-20260723-TOP_LEVEL.SLDASM</w:t>
+      </w:r>
+    </w:p>
+    <w:p>
+      <w:pPr>
+        <w:spacing w:after="0"/>
+        <w:rPr>
+          <w:rFonts w:ascii="Calibri" w:hAnsi="Calibri" w:cs="Calibri"/>
+          <w:i/>
+          <w:iCs/>
+        </w:rPr>
+      </w:pPr>
+      <w:r>
+        <w:rPr>
+          <w:rFonts w:ascii="Calibri" w:hAnsi="Calibri" w:cs="Calibri"/>
+          <w:i/>
+          <w:iCs/>
+        </w:rPr>
+        <w:t>Possible additional assemblies include:</w:t>
+      </w:r>
+    </w:p>
+    <w:p>
+      <w:pPr>
+        <w:spacing w:after="0"/>
+        <w:rPr>
+          <w:rFonts w:ascii="Calibri" w:hAnsi="Calibri" w:cs="Calibri"/>
+          <w:i/>
+          <w:iCs/>
+        </w:rPr>
+      </w:pPr>
+      <w:r>
+        <w:rPr>
+          <w:rFonts w:ascii="Calibri" w:hAnsi="Calibri" w:cs="Calibri"/>
+          <w:i/>
+          <w:iCs/>
+        </w:rPr>
+        <w:t>OF-P01-TOP-010-20260723-FLIGHT_CONFIGURATION.SLDASM</w:t>
+      </w:r>
+    </w:p>
+    <w:p>
+      <w:pPr>
+        <w:rPr>
+          <w:rFonts w:ascii="Calibri" w:hAnsi="Calibri" w:cs="Calibri"/>
+          <w:i/>
+          <w:iCs/>
+        </w:rPr>
+      </w:pPr>
+      <w:r>
+        <w:rPr>
+          <w:rFonts w:ascii="Calibri" w:hAnsi="Calibri" w:cs="Calibri"/>
+          <w:i/>
+          <w:iCs/>
+        </w:rPr>
+        <w:t>OF-P01-TOP-020-20260723-TRANSPORT_CONFIGURATION.SLDASM</w:t>
+      </w:r>
+    </w:p>
+    <w:p>
+      <w:pPr>
+        <w:rPr>
+          <w:rFonts w:ascii="Calibri" w:hAnsi="Calibri" w:cs="Calibri"/>
+          <w:b/>
+          <w:bCs/>
+        </w:rPr>
+      </w:pPr>
+      <w:r>
+        <w:rPr>
+          <w:rFonts w:ascii="Calibri" w:hAnsi="Calibri" w:cs="Calibri"/>
+          <w:b/>
+          <w:bCs/>
+        </w:rPr>
+        <w:t>10_MASTER_GEOMETRY</w:t>
+      </w:r>
+    </w:p>
+    <w:p>
+      <w:pPr>
+        <w:spacing w:after="0"/>
+        <w:rPr>
+          <w:rFonts w:ascii="Calibri" w:hAnsi="Calibri" w:cs="Calibri"/>
+        </w:rPr>
+      </w:pPr>
+      <w:r>
+        <w:rPr>
+          <w:rFonts w:ascii="Calibri" w:hAnsi="Calibri" w:cs="Calibri"/>
+        </w:rPr>
+        <w:t>Contains the reference geometry controlling the aircraft layout, such as:</w:t>
+      </w:r>
+    </w:p>
+    <w:p>
+      <w:pPr>
+        <w:pStyle w:val="ListParagraph"/>
+        <w:numPr>
+          <w:ilvl w:val="0"/>
+          <w:numId w:val="16"/>
+        </w:numPr>
+        <w:rPr>
+          <w:rFonts w:ascii="Calibri" w:hAnsi="Calibri" w:cs="Calibri"/>
+        </w:rPr>
+      </w:pPr>
+      <w:r>
+        <w:rPr>
+          <w:rFonts w:ascii="Calibri" w:hAnsi="Calibri" w:cs="Calibri"/>
+        </w:rPr>
+        <w:t>aircraft centreline;</w:t>
+      </w:r>
+    </w:p>
+    <w:p>
+      <w:pPr>
+        <w:pStyle w:val="ListParagraph"/>
+        <w:numPr>
+          <w:ilvl w:val="0"/>
+          <w:numId w:val="16"/>
+        </w:numPr>
+        <w:rPr>
+          <w:rFonts w:ascii="Calibri" w:hAnsi="Calibri" w:cs="Calibri"/>
+        </w:rPr>
+      </w:pPr>
+      <w:r>
+        <w:rPr>
+          <w:rFonts w:ascii="Calibri" w:hAnsi="Calibri" w:cs="Calibri"/>
+        </w:rPr>
+        <w:t>wing planform and airfoils;</w:t>
+      </w:r>
+    </w:p>
+    <w:p>
+      <w:pPr>
+        <w:pStyle w:val="ListParagraph"/>
+        <w:numPr>
+          <w:ilvl w:val="0"/>
+          <w:numId w:val="16"/>
+        </w:numPr>
+        <w:rPr>
+          <w:rFonts w:ascii="Calibri" w:hAnsi="Calibri" w:cs="Calibri"/>
+        </w:rPr>
+      </w:pPr>
+      <w:r>
+        <w:rPr>
+          <w:rFonts w:ascii="Calibri" w:hAnsi="Calibri" w:cs="Calibri"/>
+        </w:rPr>
+        <w:t>fuselage envelope;</w:t>
+      </w:r>
+    </w:p>
+    <w:p>
+      <w:pPr>
+        <w:pStyle w:val="ListParagraph"/>
+        <w:numPr>
+          <w:ilvl w:val="0"/>
+          <w:numId w:val="16"/>
+        </w:numPr>
+        <w:rPr>
+          <w:rFonts w:ascii="Calibri" w:hAnsi="Calibri" w:cs="Calibri"/>
+        </w:rPr>
+      </w:pPr>
+      <w:r>
+        <w:rPr>
+          <w:rFonts w:ascii="Calibri" w:hAnsi="Calibri" w:cs="Calibri"/>
+        </w:rPr>
+        <w:t>tail position;</w:t>
+      </w:r>
+    </w:p>
+    <w:p>
+      <w:pPr>
+        <w:pStyle w:val="ListParagraph"/>
+        <w:numPr>
+          <w:ilvl w:val="0"/>
+          <w:numId w:val="16"/>
+        </w:numPr>
+        <w:rPr>
+          <w:rFonts w:ascii="Calibri" w:hAnsi="Calibri" w:cs="Calibri"/>
+        </w:rPr>
+      </w:pPr>
+      <w:r>
+        <w:rPr>
+          <w:rFonts w:ascii="Calibri" w:hAnsi="Calibri" w:cs="Calibri"/>
+        </w:rPr>
+        <w:t>rotor and tilt axes;</w:t>
+      </w:r>
+    </w:p>
+    <w:p>
+      <w:pPr>
+        <w:pStyle w:val="ListParagraph"/>
+        <w:numPr>
+          <w:ilvl w:val="0"/>
+          <w:numId w:val="16"/>
+        </w:numPr>
+        <w:rPr>
+          <w:rFonts w:ascii="Calibri" w:hAnsi="Calibri" w:cs="Calibri"/>
+        </w:rPr>
+      </w:pPr>
+      <w:r>
+        <w:rPr>
+          <w:rFonts w:ascii="Calibri" w:hAnsi="Calibri" w:cs="Calibri"/>
+        </w:rPr>
+        <w:t>major interface planes.</w:t>
+      </w:r>
+    </w:p>
+    <w:p>
+      <w:pPr>
+        <w:rPr>
+          <w:rFonts w:ascii="Calibri" w:hAnsi="Calibri" w:cs="Calibri"/>
+        </w:rPr>
+      </w:pPr>
+      <w:r>
+        <w:rPr>
+          <w:rFonts w:ascii="Calibri" w:hAnsi="Calibri" w:cs="Calibri"/>
+        </w:rPr>
+        <w:t>These files define geometry but are not normally manufactured parts.</w:t>
+      </w:r>
+    </w:p>
+    <w:p>
+      <w:pPr>
+        <w:rPr>
+          <w:rFonts w:ascii="Calibri" w:hAnsi="Calibri" w:cs="Calibri"/>
+          <w:b/>
+          <w:bCs/>
+        </w:rPr>
+      </w:pPr>
+      <w:r>
+        <w:rPr>
+          <w:rFonts w:ascii="Calibri" w:hAnsi="Calibri" w:cs="Calibri"/>
+          <w:b/>
+          <w:bCs/>
+        </w:rPr>
+        <w:t>Subsystem folders</w:t>
+      </w:r>
+    </w:p>
+    <w:p>
+      <w:pPr>
+        <w:spacing w:after="0"/>
+        <w:rPr>
+          <w:rFonts w:ascii="Calibri" w:hAnsi="Calibri" w:cs="Calibri"/>
+        </w:rPr>
+      </w:pPr>
+      <w:r>
+        <w:rPr>
+          <w:rFonts w:ascii="Calibri" w:hAnsi="Calibri" w:cs="Calibri"/>
+        </w:rPr>
+        <w:t>The fuselage, wing, tail, propulsion, landing gear, avionics, and payload folders contain the parts and assemblies belonging to those systems.</w:t>
+      </w:r>
+    </w:p>
+    <w:p>
+      <w:pPr>
+        <w:rPr>
+          <w:rFonts w:ascii="Calibri" w:hAnsi="Calibri" w:cs="Calibri"/>
+        </w:rPr>
+      </w:pPr>
+      <w:r>
+        <w:rPr>
+          <w:rFonts w:ascii="Calibri" w:hAnsi="Calibri" w:cs="Calibri"/>
+        </w:rPr>
+        <w:t>A component shall be stored according to where it is primarily used.</w:t>
+      </w:r>
+    </w:p>
+    <w:p>
+      <w:pPr>
+        <w:spacing w:after="0"/>
+        <w:rPr>
+          <w:rFonts w:ascii="Calibri" w:hAnsi="Calibri" w:cs="Calibri"/>
+          <w:i/>
+          <w:iCs/>
+        </w:rPr>
+      </w:pPr>
+      <w:r>
+        <w:rPr>
+          <w:rFonts w:ascii="Calibri" w:hAnsi="Calibri" w:cs="Calibri"/>
+          <w:i/>
+          <w:iCs/>
+        </w:rPr>
+        <w:t>Examples:</w:t>
+      </w:r>
+    </w:p>
+    <w:p>
+      <w:pPr>
+        <w:spacing w:after="0"/>
+        <w:rPr>
+          <w:rFonts w:ascii="Calibri" w:hAnsi="Calibri" w:cs="Calibri"/>
+          <w:i/>
+          <w:iCs/>
+        </w:rPr>
+      </w:pPr>
+      <w:r>
+        <w:rPr>
+          <w:rFonts w:ascii="Calibri" w:hAnsi="Calibri" w:cs="Calibri"/>
+          <w:i/>
+          <w:iCs/>
+        </w:rPr>
+        <w:t>Wing servo bracket</w:t>
+      </w:r>
+    </w:p>
+    <w:p>
+      <w:pPr>
+        <w:spacing w:after="0"/>
+        <w:rPr>
+          <w:rFonts w:ascii="Calibri" w:hAnsi="Calibri" w:cs="Calibri"/>
+          <w:i/>
+          <w:iCs/>
+        </w:rPr>
+      </w:pPr>
+      <w:r>
+        <w:rPr>
+          <w:rFonts w:ascii="Calibri" w:hAnsi="Calibri" w:cs="Calibri"/>
+          <w:i/>
+          <w:iCs/>
+        </w:rPr>
+        <w:t>→ 30_WING/Parts/</w:t>
+      </w:r>
+    </w:p>
+    <w:p>
+      <w:pPr>
+        <w:spacing w:after="0"/>
+        <w:rPr>
+          <w:rFonts w:ascii="Calibri" w:hAnsi="Calibri" w:cs="Calibri"/>
+          <w:i/>
+          <w:iCs/>
+        </w:rPr>
+      </w:pPr>
+      <w:r>
+        <w:rPr>
+          <w:rFonts w:ascii="Calibri" w:hAnsi="Calibri" w:cs="Calibri"/>
+          <w:i/>
+          <w:iCs/>
+        </w:rPr>
+        <w:t>Motor mount</w:t>
+      </w:r>
+    </w:p>
+    <w:p>
+      <w:pPr>
+        <w:spacing w:after="0"/>
+        <w:rPr>
+          <w:rFonts w:ascii="Calibri" w:hAnsi="Calibri" w:cs="Calibri"/>
+          <w:i/>
+          <w:iCs/>
+        </w:rPr>
+      </w:pPr>
+      <w:r>
+        <w:rPr>
+          <w:rFonts w:ascii="Calibri" w:hAnsi="Calibri" w:cs="Calibri"/>
+          <w:i/>
+          <w:iCs/>
+        </w:rPr>
+        <w:t>→ 50_PROPULSION_AND_TILT/Parts/</w:t>
+      </w:r>
+    </w:p>
+    <w:p>
+      <w:pPr>
+        <w:spacing w:after="0"/>
+        <w:rPr>
+          <w:rFonts w:ascii="Calibri" w:hAnsi="Calibri" w:cs="Calibri"/>
+          <w:i/>
+          <w:iCs/>
+        </w:rPr>
+      </w:pPr>
+      <w:r>
+        <w:rPr>
+          <w:rFonts w:ascii="Calibri" w:hAnsi="Calibri" w:cs="Calibri"/>
+          <w:i/>
+          <w:iCs/>
+        </w:rPr>
+        <w:t>Flight-controller tray</w:t>
+      </w:r>
+    </w:p>
+    <w:p>
+      <w:pPr>
+        <w:rPr>
+          <w:rFonts w:ascii="Calibri" w:hAnsi="Calibri" w:cs="Calibri"/>
+          <w:i/>
+          <w:iCs/>
+        </w:rPr>
+      </w:pPr>
+      <w:r>
+        <w:rPr>
+          <w:rFonts w:ascii="Calibri" w:hAnsi="Calibri" w:cs="Calibri"/>
+          <w:i/>
+          <w:iCs/>
+        </w:rPr>
+        <w:t>→ 70_AVIONICS_AND_ELECTRICAL/Parts/</w:t>
+      </w:r>
+    </w:p>
+    <w:p>
+      <w:pPr>
+        <w:spacing w:after="120"/>
+        <w:rPr>
+          <w:rFonts w:ascii="Calibri" w:hAnsi="Calibri" w:cs="Calibri"/>
+          <w:b/>
+          <w:bCs/>
+        </w:rPr>
+      </w:pPr>
+      <w:r>
+        <w:rPr>
+          <w:rFonts w:ascii="Calibri" w:hAnsi="Calibri" w:cs="Calibri"/>
+          <w:b/>
+          <w:bCs/>
+        </w:rPr>
+        <w:t>99_ARCHIVE</w:t>
+      </w:r>
+    </w:p>
+    <w:p>
+      <w:pPr>
+        <w:spacing w:after="0"/>
+        <w:rPr>
+          <w:rFonts w:ascii="Calibri" w:hAnsi="Calibri" w:cs="Calibri"/>
+        </w:rPr>
+      </w:pPr>
+      <w:r>
+        <w:rPr>
+          <w:rFonts w:ascii="Calibri" w:hAnsi="Calibri" w:cs="Calibri"/>
+        </w:rPr>
+        <w:t>Contains superseded, abandoned, or historical files.</w:t>
+      </w:r>
+    </w:p>
+    <w:p>
+      <w:pPr>
+        <w:spacing w:after="120"/>
+        <w:rPr>
+          <w:rFonts w:ascii="Calibri" w:hAnsi="Calibri" w:cs="Calibri"/>
+          <w:u w:val="single"/>
+        </w:rPr>
+      </w:pPr>
+      <w:r>
+        <w:rPr>
+          <w:rFonts w:ascii="Calibri" w:hAnsi="Calibri" w:cs="Calibri"/>
+          <w:u w:val="single"/>
+        </w:rPr>
+        <w:t>Active assemblies shall never reference files stored in 99_ARCHIVE.</w:t>
+      </w:r>
+    </w:p>
     <w:p>
       <w:pPr>
         <w:rPr>
@@ -3177,7 +2189,7 @@
         <w:rPr>
           <w:rFonts w:ascii="Calibri" w:hAnsi="Calibri" w:cs="Calibri"/>
         </w:rPr>
-        <w:t>YYYYMMDD</w:t>
+        <w:t>YYMMDD</w:t>
       </w:r>
     </w:p>
     <w:p>
@@ -3212,7 +2224,7 @@
           <w:i/>
           <w:iCs/>
         </w:rPr>
-        <w:t>20260723</w:t>
+        <w:t>260723</w:t>
       </w:r>
     </w:p>
     <w:p>
@@ -5466,21 +4478,7 @@
         <w:rPr>
           <w:rFonts w:ascii="Calibri" w:hAnsi="Calibri" w:cs="Calibri"/>
         </w:rPr>
-        <w:t>PUR-[MANUFACTURER]-[MODEL]-[DESCRIPTION</w:t>
-      </w:r>
-      <w:proofErr w:type="gramStart"/>
-      <w:r>
-        <w:rPr>
-          <w:rFonts w:ascii="Calibri" w:hAnsi="Calibri" w:cs="Calibri"/>
-        </w:rPr>
-        <w:t>].[</w:t>
-      </w:r>
-      <w:proofErr w:type="gramEnd"/>
-      <w:r>
-        <w:rPr>
-          <w:rFonts w:ascii="Calibri" w:hAnsi="Calibri" w:cs="Calibri"/>
-        </w:rPr>
-        <w:t>EXTENSION]</w:t>
+        <w:t>PUR-[MANUFACTURER]-[MODEL]-[DESCRIPTION].[EXTENSION]</w:t>
       </w:r>
     </w:p>
     <w:p>
@@ -5577,61 +4575,29 @@
           <w:rFonts w:ascii="Calibri" w:hAnsi="Calibri" w:cs="Calibri"/>
           <w:u w:val="single"/>
         </w:rPr>
-        <w:t xml:space="preserve">In case that we do not have the 3D model of a purchased </w:t>
-      </w:r>
-      <w:proofErr w:type="gramStart"/>
+        <w:t>In case that we do not have the 3D model of a purchased part, a dummy model could be created using</w:t>
+      </w:r>
       <w:r>
         <w:rPr>
           <w:rFonts w:ascii="Calibri" w:hAnsi="Calibri" w:cs="Calibri"/>
           <w:u w:val="single"/>
         </w:rPr>
-        <w:t>part,</w:t>
-      </w:r>
-      <w:proofErr w:type="gramEnd"/>
-      <w:r>
+        <w:t xml:space="preserve"> the following structure:</w:t>
+      </w:r>
+    </w:p>
+    <w:p>
+      <w:pPr>
         <w:rPr>
           <w:rFonts w:ascii="Calibri" w:hAnsi="Calibri" w:cs="Calibri"/>
           <w:u w:val="single"/>
         </w:rPr>
-        <w:t xml:space="preserve"> a dummy model could be created using</w:t>
-      </w:r>
+      </w:pPr>
       <w:r>
         <w:rPr>
           <w:rFonts w:ascii="Calibri" w:hAnsi="Calibri" w:cs="Calibri"/>
           <w:u w:val="single"/>
         </w:rPr>
-        <w:t xml:space="preserve"> the following structure:</w:t>
-      </w:r>
-    </w:p>
-    <w:p>
-      <w:pPr>
-        <w:rPr>
-          <w:rFonts w:ascii="Calibri" w:hAnsi="Calibri" w:cs="Calibri"/>
-          <w:u w:val="single"/>
-        </w:rPr>
-      </w:pPr>
-      <w:r>
-        <w:rPr>
-          <w:rFonts w:ascii="Calibri" w:hAnsi="Calibri" w:cs="Calibri"/>
-          <w:u w:val="single"/>
-        </w:rPr>
-        <w:t>PUR_DUMMY-[MANUFACTURER]-[MODEL]-[DESCRIPTION</w:t>
-      </w:r>
-      <w:proofErr w:type="gramStart"/>
-      <w:r>
-        <w:rPr>
-          <w:rFonts w:ascii="Calibri" w:hAnsi="Calibri" w:cs="Calibri"/>
-          <w:u w:val="single"/>
-        </w:rPr>
-        <w:t>].[</w:t>
-      </w:r>
-      <w:proofErr w:type="gramEnd"/>
-      <w:r>
-        <w:rPr>
-          <w:rFonts w:ascii="Calibri" w:hAnsi="Calibri" w:cs="Calibri"/>
-          <w:u w:val="single"/>
-        </w:rPr>
-        <w:t>EXTENSION]</w:t>
+        <w:t>PUR_DUMMY-[MANUFACTURER]-[MODEL]-[DESCRIPTION].[EXTENSION]</w:t>
       </w:r>
     </w:p>
     <w:p>
@@ -5690,21 +4656,7 @@
         <w:rPr>
           <w:rFonts w:ascii="Calibri" w:hAnsi="Calibri" w:cs="Calibri"/>
         </w:rPr>
-        <w:t>STD-[STANDARD]-[SIZE]-[DESCRIPTION</w:t>
-      </w:r>
-      <w:proofErr w:type="gramStart"/>
-      <w:r>
-        <w:rPr>
-          <w:rFonts w:ascii="Calibri" w:hAnsi="Calibri" w:cs="Calibri"/>
-        </w:rPr>
-        <w:t>].[</w:t>
-      </w:r>
-      <w:proofErr w:type="gramEnd"/>
-      <w:r>
-        <w:rPr>
-          <w:rFonts w:ascii="Calibri" w:hAnsi="Calibri" w:cs="Calibri"/>
-        </w:rPr>
-        <w:t>EXTENSION]</w:t>
+        <w:t>STD-[STANDARD]-[SIZE]-[DESCRIPTION].[EXTENSION]</w:t>
       </w:r>
     </w:p>
     <w:p>
@@ -5809,7 +4761,7 @@
           <w:rFonts w:ascii="Calibri" w:hAnsi="Calibri" w:cs="Calibri"/>
         </w:rPr>
         <w:pict w14:anchorId="1F1F1B07">
-          <v:rect id="_x0000_i1034" style="width:0;height:1.5pt" o:hralign="center" o:hrstd="t" o:hr="t" fillcolor="#a0a0a0" stroked="f"/>
+          <v:rect id="_x0000_i1057" style="width:0;height:1.5pt" o:hralign="center" o:hrstd="t" o:hr="t" fillcolor="#a0a0a0" stroked="f"/>
         </w:pict>
       </w:r>
     </w:p>
@@ -5951,7 +4903,7 @@
           <w:rFonts w:ascii="Calibri" w:hAnsi="Calibri" w:cs="Calibri"/>
         </w:rPr>
         <w:pict w14:anchorId="214CE9E4">
-          <v:rect id="_x0000_i1026" style="width:0;height:1.5pt" o:hralign="center" o:hrstd="t" o:hr="t" fillcolor="#a0a0a0" stroked="f"/>
+          <v:rect id="_x0000_i1058" style="width:0;height:1.5pt" o:hralign="center" o:hrstd="t" o:hr="t" fillcolor="#a0a0a0" stroked="f"/>
         </w:pict>
       </w:r>
     </w:p>
@@ -6176,7 +5128,7 @@
           <w:rFonts w:ascii="Calibri" w:hAnsi="Calibri" w:cs="Calibri"/>
         </w:rPr>
         <w:pict w14:anchorId="1EB5A6F9">
-          <v:rect id="_x0000_i1027" style="width:0;height:1.5pt" o:hralign="center" o:hrstd="t" o:hr="t" fillcolor="#a0a0a0" stroked="f"/>
+          <v:rect id="_x0000_i1059" style="width:0;height:1.5pt" o:hralign="center" o:hrstd="t" o:hr="t" fillcolor="#a0a0a0" stroked="f"/>
         </w:pict>
       </w:r>
     </w:p>
@@ -6366,7 +5318,7 @@
           <w:rFonts w:ascii="Calibri" w:hAnsi="Calibri" w:cs="Calibri"/>
         </w:rPr>
         <w:pict w14:anchorId="39D35B73">
-          <v:rect id="_x0000_i1028" style="width:0;height:1.5pt" o:hralign="center" o:hrstd="t" o:hr="t" fillcolor="#a0a0a0" stroked="f"/>
+          <v:rect id="_x0000_i1060" style="width:0;height:1.5pt" o:hralign="center" o:hrstd="t" o:hr="t" fillcolor="#a0a0a0" stroked="f"/>
         </w:pict>
       </w:r>
     </w:p>
@@ -6550,7 +5502,7 @@
           <w:rFonts w:ascii="Calibri" w:hAnsi="Calibri" w:cs="Calibri"/>
         </w:rPr>
         <w:pict w14:anchorId="7C681F11">
-          <v:rect id="_x0000_i1029" style="width:0;height:1.5pt" o:hralign="center" o:hrstd="t" o:hr="t" fillcolor="#a0a0a0" stroked="f"/>
+          <v:rect id="_x0000_i1061" style="width:0;height:1.5pt" o:hralign="center" o:hrstd="t" o:hr="t" fillcolor="#a0a0a0" stroked="f"/>
         </w:pict>
       </w:r>
     </w:p>
@@ -6718,7 +5670,7 @@
           <w:rFonts w:ascii="Calibri" w:hAnsi="Calibri" w:cs="Calibri"/>
         </w:rPr>
         <w:pict w14:anchorId="6E295704">
-          <v:rect id="_x0000_i1030" style="width:0;height:1.5pt" o:hralign="center" o:hrstd="t" o:hr="t" fillcolor="#a0a0a0" stroked="f"/>
+          <v:rect id="_x0000_i1062" style="width:0;height:1.5pt" o:hralign="center" o:hrstd="t" o:hr="t" fillcolor="#a0a0a0" stroked="f"/>
         </w:pict>
       </w:r>
     </w:p>
@@ -6856,27 +5808,7 @@
         <w:rPr>
           <w:rFonts w:ascii="Calibri" w:hAnsi="Calibri" w:cs="Calibri"/>
         </w:rPr>
-        <w:t>a “</w:t>
-      </w:r>
-      <w:proofErr w:type="spellStart"/>
-      <w:r>
-        <w:rPr>
-          <w:rFonts w:ascii="Calibri" w:hAnsi="Calibri" w:cs="Calibri"/>
-        </w:rPr>
-        <w:t>Push</w:t>
-      </w:r>
-      <w:r>
-        <w:rPr>
-          <w:rFonts w:ascii="Calibri" w:hAnsi="Calibri" w:cs="Calibri"/>
-        </w:rPr>
-        <w:t>”in</w:t>
-      </w:r>
-      <w:proofErr w:type="spellEnd"/>
-      <w:r>
-        <w:rPr>
-          <w:rFonts w:ascii="Calibri" w:hAnsi="Calibri" w:cs="Calibri"/>
-        </w:rPr>
-        <w:t xml:space="preserve"> GitHub should be initiated only after all open files are closed;</w:t>
+        <w:t>a “Push”in GitHub should be initiated only after all open files are closed;</w:t>
       </w:r>
     </w:p>
     <w:p>
@@ -6895,33 +5827,7 @@
         <w:rPr>
           <w:rFonts w:ascii="Calibri" w:hAnsi="Calibri" w:cs="Calibri"/>
         </w:rPr>
-        <w:t>descriptive name for the GitHub “</w:t>
-      </w:r>
-      <w:r>
-        <w:rPr>
-          <w:rFonts w:ascii="Calibri" w:hAnsi="Calibri" w:cs="Calibri"/>
-        </w:rPr>
-        <w:t>Push</w:t>
-      </w:r>
-      <w:r>
-        <w:rPr>
-          <w:rFonts w:ascii="Calibri" w:hAnsi="Calibri" w:cs="Calibri"/>
-        </w:rPr>
-        <w:t xml:space="preserve">” should be used </w:t>
-      </w:r>
-      <w:proofErr w:type="gramStart"/>
-      <w:r>
-        <w:rPr>
-          <w:rFonts w:ascii="Calibri" w:hAnsi="Calibri" w:cs="Calibri"/>
-        </w:rPr>
-        <w:t>in order to</w:t>
-      </w:r>
-      <w:proofErr w:type="gramEnd"/>
-      <w:r>
-        <w:rPr>
-          <w:rFonts w:ascii="Calibri" w:hAnsi="Calibri" w:cs="Calibri"/>
-        </w:rPr>
-        <w:t xml:space="preserve"> have a track record and use of the history log;</w:t>
+        <w:t>descriptive name for the GitHub “Push” should be used in order to have a track record and use of the history log;</w:t>
       </w:r>
     </w:p>
     <w:p>
@@ -6935,7 +5841,7 @@
           <w:rFonts w:ascii="Calibri" w:hAnsi="Calibri" w:cs="Calibri"/>
         </w:rPr>
         <w:pict w14:anchorId="42FC33AE">
-          <v:rect id="_x0000_i1031" style="width:0;height:1.5pt" o:hralign="center" o:hrstd="t" o:hr="t" fillcolor="#a0a0a0" stroked="f"/>
+          <v:rect id="_x0000_i1063" style="width:0;height:1.5pt" o:hralign="center" o:hrstd="t" o:hr="t" fillcolor="#a0a0a0" stroked="f"/>
         </w:pict>
       </w:r>
     </w:p>
@@ -7144,7 +6050,7 @@
           <w:rFonts w:ascii="Calibri" w:hAnsi="Calibri" w:cs="Calibri"/>
         </w:rPr>
         <w:pict w14:anchorId="60578488">
-          <v:rect id="_x0000_i1032" style="width:0;height:1.5pt" o:hralign="center" o:hrstd="t" o:hr="t" fillcolor="#a0a0a0" stroked="f"/>
+          <v:rect id="_x0000_i1064" style="width:0;height:1.5pt" o:hralign="center" o:hrstd="t" o:hr="t" fillcolor="#a0a0a0" stroked="f"/>
         </w:pict>
       </w:r>
     </w:p>
@@ -7482,6 +6388,95 @@
     </w:lvl>
   </w:abstractNum>
   <w:abstractNum w:abstractNumId="1" w15:restartNumberingAfterBreak="0">
+    <w:nsid w:val="2D566AD4"/>
+    <w:multiLevelType w:val="hybridMultilevel"/>
+    <w:tmpl w:val="54B40D4A"/>
+    <w:lvl w:ilvl="0" w:tplc="FFFFFFFF">
+      <w:start w:val="1"/>
+      <w:numFmt w:val="decimal"/>
+      <w:lvlText w:val="%1."/>
+      <w:lvlJc w:val="left"/>
+      <w:pPr>
+        <w:ind w:left="720" w:hanging="360"/>
+      </w:pPr>
+      <w:rPr>
+        <w:rFonts w:hint="default"/>
+      </w:rPr>
+    </w:lvl>
+    <w:lvl w:ilvl="1" w:tplc="FFFFFFFF" w:tentative="1">
+      <w:start w:val="1"/>
+      <w:numFmt w:val="lowerLetter"/>
+      <w:lvlText w:val="%2."/>
+      <w:lvlJc w:val="left"/>
+      <w:pPr>
+        <w:ind w:left="1440" w:hanging="360"/>
+      </w:pPr>
+    </w:lvl>
+    <w:lvl w:ilvl="2" w:tplc="FFFFFFFF" w:tentative="1">
+      <w:start w:val="1"/>
+      <w:numFmt w:val="lowerRoman"/>
+      <w:lvlText w:val="%3."/>
+      <w:lvlJc w:val="right"/>
+      <w:pPr>
+        <w:ind w:left="2160" w:hanging="180"/>
+      </w:pPr>
+    </w:lvl>
+    <w:lvl w:ilvl="3" w:tplc="FFFFFFFF" w:tentative="1">
+      <w:start w:val="1"/>
+      <w:numFmt w:val="decimal"/>
+      <w:lvlText w:val="%4."/>
+      <w:lvlJc w:val="left"/>
+      <w:pPr>
+        <w:ind w:left="2880" w:hanging="360"/>
+      </w:pPr>
+    </w:lvl>
+    <w:lvl w:ilvl="4" w:tplc="FFFFFFFF" w:tentative="1">
+      <w:start w:val="1"/>
+      <w:numFmt w:val="lowerLetter"/>
+      <w:lvlText w:val="%5."/>
+      <w:lvlJc w:val="left"/>
+      <w:pPr>
+        <w:ind w:left="3600" w:hanging="360"/>
+      </w:pPr>
+    </w:lvl>
+    <w:lvl w:ilvl="5" w:tplc="FFFFFFFF" w:tentative="1">
+      <w:start w:val="1"/>
+      <w:numFmt w:val="lowerRoman"/>
+      <w:lvlText w:val="%6."/>
+      <w:lvlJc w:val="right"/>
+      <w:pPr>
+        <w:ind w:left="4320" w:hanging="180"/>
+      </w:pPr>
+    </w:lvl>
+    <w:lvl w:ilvl="6" w:tplc="FFFFFFFF" w:tentative="1">
+      <w:start w:val="1"/>
+      <w:numFmt w:val="decimal"/>
+      <w:lvlText w:val="%7."/>
+      <w:lvlJc w:val="left"/>
+      <w:pPr>
+        <w:ind w:left="5040" w:hanging="360"/>
+      </w:pPr>
+    </w:lvl>
+    <w:lvl w:ilvl="7" w:tplc="FFFFFFFF" w:tentative="1">
+      <w:start w:val="1"/>
+      <w:numFmt w:val="lowerLetter"/>
+      <w:lvlText w:val="%8."/>
+      <w:lvlJc w:val="left"/>
+      <w:pPr>
+        <w:ind w:left="5760" w:hanging="360"/>
+      </w:pPr>
+    </w:lvl>
+    <w:lvl w:ilvl="8" w:tplc="FFFFFFFF" w:tentative="1">
+      <w:start w:val="1"/>
+      <w:numFmt w:val="lowerRoman"/>
+      <w:lvlText w:val="%9."/>
+      <w:lvlJc w:val="right"/>
+      <w:pPr>
+        <w:ind w:left="6480" w:hanging="180"/>
+      </w:pPr>
+    </w:lvl>
+  </w:abstractNum>
+  <w:abstractNum w:abstractNumId="2" w15:restartNumberingAfterBreak="0">
     <w:nsid w:val="304E5B8D"/>
     <w:multiLevelType w:val="hybridMultilevel"/>
     <w:tmpl w:val="D0D2AE1E"/>
@@ -7594,7 +6589,7 @@
       </w:rPr>
     </w:lvl>
   </w:abstractNum>
-  <w:abstractNum w:abstractNumId="2" w15:restartNumberingAfterBreak="0">
+  <w:abstractNum w:abstractNumId="3" w15:restartNumberingAfterBreak="0">
     <w:nsid w:val="338A7CBD"/>
     <w:multiLevelType w:val="multilevel"/>
     <w:tmpl w:val="68108378"/>
@@ -7707,7 +6702,7 @@
       </w:pPr>
     </w:lvl>
   </w:abstractNum>
-  <w:abstractNum w:abstractNumId="3" w15:restartNumberingAfterBreak="0">
+  <w:abstractNum w:abstractNumId="4" w15:restartNumberingAfterBreak="0">
     <w:nsid w:val="398B57D5"/>
     <w:multiLevelType w:val="multilevel"/>
     <w:tmpl w:val="D85A77BE"/>
@@ -7820,7 +6815,7 @@
       </w:pPr>
     </w:lvl>
   </w:abstractNum>
-  <w:abstractNum w:abstractNumId="4" w15:restartNumberingAfterBreak="0">
+  <w:abstractNum w:abstractNumId="5" w15:restartNumberingAfterBreak="0">
     <w:nsid w:val="42BF5C81"/>
     <w:multiLevelType w:val="hybridMultilevel"/>
     <w:tmpl w:val="54B40D4A"/>
@@ -7909,7 +6904,7 @@
       </w:pPr>
     </w:lvl>
   </w:abstractNum>
-  <w:abstractNum w:abstractNumId="5" w15:restartNumberingAfterBreak="0">
+  <w:abstractNum w:abstractNumId="6" w15:restartNumberingAfterBreak="0">
     <w:nsid w:val="43461FC9"/>
     <w:multiLevelType w:val="hybridMultilevel"/>
     <w:tmpl w:val="2D3254B4"/>
@@ -8022,7 +7017,7 @@
       </w:rPr>
     </w:lvl>
   </w:abstractNum>
-  <w:abstractNum w:abstractNumId="6" w15:restartNumberingAfterBreak="0">
+  <w:abstractNum w:abstractNumId="7" w15:restartNumberingAfterBreak="0">
     <w:nsid w:val="4B122BB1"/>
     <w:multiLevelType w:val="hybridMultilevel"/>
     <w:tmpl w:val="BE8231E6"/>
@@ -8135,7 +7130,7 @@
       </w:rPr>
     </w:lvl>
   </w:abstractNum>
-  <w:abstractNum w:abstractNumId="7" w15:restartNumberingAfterBreak="0">
+  <w:abstractNum w:abstractNumId="8" w15:restartNumberingAfterBreak="0">
     <w:nsid w:val="4FA9471B"/>
     <w:multiLevelType w:val="hybridMultilevel"/>
     <w:tmpl w:val="2068B2FA"/>
@@ -8248,7 +7243,7 @@
       </w:rPr>
     </w:lvl>
   </w:abstractNum>
-  <w:abstractNum w:abstractNumId="8" w15:restartNumberingAfterBreak="0">
+  <w:abstractNum w:abstractNumId="9" w15:restartNumberingAfterBreak="0">
     <w:nsid w:val="508074C5"/>
     <w:multiLevelType w:val="hybridMultilevel"/>
     <w:tmpl w:val="E96A4116"/>
@@ -8361,7 +7356,7 @@
       </w:rPr>
     </w:lvl>
   </w:abstractNum>
-  <w:abstractNum w:abstractNumId="9" w15:restartNumberingAfterBreak="0">
+  <w:abstractNum w:abstractNumId="10" w15:restartNumberingAfterBreak="0">
     <w:nsid w:val="50E82795"/>
     <w:multiLevelType w:val="multilevel"/>
     <w:tmpl w:val="516868F8"/>
@@ -8474,7 +7469,7 @@
       </w:pPr>
     </w:lvl>
   </w:abstractNum>
-  <w:abstractNum w:abstractNumId="10" w15:restartNumberingAfterBreak="0">
+  <w:abstractNum w:abstractNumId="11" w15:restartNumberingAfterBreak="0">
     <w:nsid w:val="51462841"/>
     <w:multiLevelType w:val="multilevel"/>
     <w:tmpl w:val="020E23C4"/>
@@ -8587,7 +7582,7 @@
       </w:pPr>
     </w:lvl>
   </w:abstractNum>
-  <w:abstractNum w:abstractNumId="11" w15:restartNumberingAfterBreak="0">
+  <w:abstractNum w:abstractNumId="12" w15:restartNumberingAfterBreak="0">
     <w:nsid w:val="57760C79"/>
     <w:multiLevelType w:val="hybridMultilevel"/>
     <w:tmpl w:val="484C12E0"/>
@@ -8700,7 +7695,7 @@
       </w:rPr>
     </w:lvl>
   </w:abstractNum>
-  <w:abstractNum w:abstractNumId="12" w15:restartNumberingAfterBreak="0">
+  <w:abstractNum w:abstractNumId="13" w15:restartNumberingAfterBreak="0">
     <w:nsid w:val="5B5B751B"/>
     <w:multiLevelType w:val="hybridMultilevel"/>
     <w:tmpl w:val="D758D522"/>
@@ -8813,7 +7808,7 @@
       </w:rPr>
     </w:lvl>
   </w:abstractNum>
-  <w:abstractNum w:abstractNumId="13" w15:restartNumberingAfterBreak="0">
+  <w:abstractNum w:abstractNumId="14" w15:restartNumberingAfterBreak="0">
     <w:nsid w:val="5D6B1B94"/>
     <w:multiLevelType w:val="multilevel"/>
     <w:tmpl w:val="767AC472"/>
@@ -8926,7 +7921,7 @@
       </w:pPr>
     </w:lvl>
   </w:abstractNum>
-  <w:abstractNum w:abstractNumId="14" w15:restartNumberingAfterBreak="0">
+  <w:abstractNum w:abstractNumId="15" w15:restartNumberingAfterBreak="0">
     <w:nsid w:val="64130484"/>
     <w:multiLevelType w:val="hybridMultilevel"/>
     <w:tmpl w:val="C8CA6AC0"/>
@@ -9039,7 +8034,7 @@
       </w:rPr>
     </w:lvl>
   </w:abstractNum>
-  <w:abstractNum w:abstractNumId="15" w15:restartNumberingAfterBreak="0">
+  <w:abstractNum w:abstractNumId="16" w15:restartNumberingAfterBreak="0">
     <w:nsid w:val="6C3E5BD3"/>
     <w:multiLevelType w:val="hybridMultilevel"/>
     <w:tmpl w:val="F2DEBFA2"/>
@@ -9152,7 +8147,7 @@
       </w:rPr>
     </w:lvl>
   </w:abstractNum>
-  <w:abstractNum w:abstractNumId="16" w15:restartNumberingAfterBreak="0">
+  <w:abstractNum w:abstractNumId="17" w15:restartNumberingAfterBreak="0">
     <w:nsid w:val="707F094F"/>
     <w:multiLevelType w:val="hybridMultilevel"/>
     <w:tmpl w:val="B6D49978"/>
@@ -9265,7 +8260,7 @@
       </w:rPr>
     </w:lvl>
   </w:abstractNum>
-  <w:abstractNum w:abstractNumId="17" w15:restartNumberingAfterBreak="0">
+  <w:abstractNum w:abstractNumId="18" w15:restartNumberingAfterBreak="0">
     <w:nsid w:val="77456CDB"/>
     <w:multiLevelType w:val="hybridMultilevel"/>
     <w:tmpl w:val="D66C6EAA"/>
@@ -9378,7 +8373,7 @@
       </w:rPr>
     </w:lvl>
   </w:abstractNum>
-  <w:abstractNum w:abstractNumId="18" w15:restartNumberingAfterBreak="0">
+  <w:abstractNum w:abstractNumId="19" w15:restartNumberingAfterBreak="0">
     <w:nsid w:val="7890023A"/>
     <w:multiLevelType w:val="hybridMultilevel"/>
     <w:tmpl w:val="266C6CEE"/>
@@ -9492,61 +8487,64 @@
     </w:lvl>
   </w:abstractNum>
   <w:num w:numId="1" w16cid:durableId="207450391">
-    <w:abstractNumId w:val="2"/>
+    <w:abstractNumId w:val="3"/>
   </w:num>
   <w:num w:numId="2" w16cid:durableId="1134759246">
+    <w:abstractNumId w:val="11"/>
+  </w:num>
+  <w:num w:numId="3" w16cid:durableId="919875557">
     <w:abstractNumId w:val="10"/>
   </w:num>
-  <w:num w:numId="3" w16cid:durableId="919875557">
-    <w:abstractNumId w:val="9"/>
-  </w:num>
   <w:num w:numId="4" w16cid:durableId="14427011">
-    <w:abstractNumId w:val="13"/>
+    <w:abstractNumId w:val="14"/>
   </w:num>
   <w:num w:numId="5" w16cid:durableId="69809897">
+    <w:abstractNumId w:val="7"/>
+  </w:num>
+  <w:num w:numId="6" w16cid:durableId="760217662">
+    <w:abstractNumId w:val="18"/>
+  </w:num>
+  <w:num w:numId="7" w16cid:durableId="1344865125">
+    <w:abstractNumId w:val="12"/>
+  </w:num>
+  <w:num w:numId="8" w16cid:durableId="199632274">
+    <w:abstractNumId w:val="19"/>
+  </w:num>
+  <w:num w:numId="9" w16cid:durableId="283656401">
+    <w:abstractNumId w:val="15"/>
+  </w:num>
+  <w:num w:numId="10" w16cid:durableId="1030843020">
     <w:abstractNumId w:val="6"/>
   </w:num>
-  <w:num w:numId="6" w16cid:durableId="760217662">
+  <w:num w:numId="11" w16cid:durableId="2120755245">
     <w:abstractNumId w:val="17"/>
   </w:num>
-  <w:num w:numId="7" w16cid:durableId="1344865125">
-    <w:abstractNumId w:val="11"/>
-  </w:num>
-  <w:num w:numId="8" w16cid:durableId="199632274">
-    <w:abstractNumId w:val="18"/>
-  </w:num>
-  <w:num w:numId="9" w16cid:durableId="283656401">
-    <w:abstractNumId w:val="14"/>
-  </w:num>
-  <w:num w:numId="10" w16cid:durableId="1030843020">
-    <w:abstractNumId w:val="5"/>
-  </w:num>
-  <w:num w:numId="11" w16cid:durableId="2120755245">
-    <w:abstractNumId w:val="16"/>
-  </w:num>
   <w:num w:numId="12" w16cid:durableId="1606421856">
-    <w:abstractNumId w:val="7"/>
+    <w:abstractNumId w:val="8"/>
   </w:num>
   <w:num w:numId="13" w16cid:durableId="539977975">
-    <w:abstractNumId w:val="4"/>
+    <w:abstractNumId w:val="5"/>
   </w:num>
   <w:num w:numId="14" w16cid:durableId="222958046">
     <w:abstractNumId w:val="0"/>
   </w:num>
   <w:num w:numId="15" w16cid:durableId="525598798">
-    <w:abstractNumId w:val="15"/>
+    <w:abstractNumId w:val="16"/>
   </w:num>
   <w:num w:numId="16" w16cid:durableId="100340722">
-    <w:abstractNumId w:val="8"/>
+    <w:abstractNumId w:val="9"/>
   </w:num>
   <w:num w:numId="17" w16cid:durableId="1389036196">
-    <w:abstractNumId w:val="3"/>
+    <w:abstractNumId w:val="4"/>
   </w:num>
   <w:num w:numId="18" w16cid:durableId="771054005">
-    <w:abstractNumId w:val="1"/>
+    <w:abstractNumId w:val="2"/>
   </w:num>
   <w:num w:numId="19" w16cid:durableId="366834454">
-    <w:abstractNumId w:val="12"/>
+    <w:abstractNumId w:val="13"/>
+  </w:num>
+  <w:num w:numId="20" w16cid:durableId="558980995">
+    <w:abstractNumId w:val="1"/>
   </w:num>
   <w:numIdMacAtCleanup w:val="19"/>
 </w:numbering>
@@ -9952,7 +8950,7 @@
   <w:style w:type="paragraph" w:default="1" w:styleId="Normal">
     <w:name w:val="Normal"/>
     <w:qFormat/>
-    <w:rsid w:val="00963E7C"/>
+    <w:rsid w:val="001307D9"/>
   </w:style>
   <w:style w:type="paragraph" w:styleId="Heading1">
     <w:name w:val="heading 1"/>
@@ -10155,7 +9153,6 @@
   <w:style w:type="character" w:default="1" w:styleId="DefaultParagraphFont">
     <w:name w:val="Default Paragraph Font"/>
     <w:uiPriority w:val="1"/>
-    <w:semiHidden/>
     <w:unhideWhenUsed/>
   </w:style>
   <w:style w:type="table" w:default="1" w:styleId="TableNormal">

</xml_diff>